<commit_message>
Jul 3, 2026, 5:01 PM
</commit_message>
<xml_diff>
--- a/Notes.docx
+++ b/Notes.docx
@@ -603,84 +603,161 @@
           <w:lang w:val="en-CA"/>
         </w:rPr>
       </w:pPr>
-    </w:p>
-    <w:p>
-      <w:pPr>
-        <w:rPr>
-          <w:rFonts w:ascii="Times New Roman" w:hAnsi="Times New Roman" w:cs="Times New Roman"/>
-          <w:sz w:val="24"/>
-          <w:szCs w:val="24"/>
-          <w:lang w:val="en-CA"/>
-        </w:rPr>
-      </w:pPr>
-    </w:p>
-    <w:p>
-      <w:pPr>
-        <w:rPr>
-          <w:rFonts w:ascii="Times New Roman" w:hAnsi="Times New Roman" w:cs="Times New Roman"/>
-          <w:sz w:val="24"/>
-          <w:szCs w:val="24"/>
-          <w:lang w:val="en-CA"/>
-        </w:rPr>
-      </w:pPr>
-    </w:p>
-    <w:p>
-      <w:pPr>
-        <w:rPr>
-          <w:rFonts w:ascii="Times New Roman" w:hAnsi="Times New Roman" w:cs="Times New Roman"/>
-          <w:sz w:val="24"/>
-          <w:szCs w:val="24"/>
-          <w:lang w:val="en-CA"/>
-        </w:rPr>
-      </w:pPr>
-    </w:p>
-    <w:p>
-      <w:pPr>
-        <w:rPr>
-          <w:rFonts w:ascii="Times New Roman" w:hAnsi="Times New Roman" w:cs="Times New Roman"/>
-          <w:sz w:val="24"/>
-          <w:szCs w:val="24"/>
-          <w:lang w:val="en-CA"/>
-        </w:rPr>
-      </w:pPr>
-    </w:p>
-    <w:p>
-      <w:pPr>
-        <w:rPr>
-          <w:rFonts w:ascii="Times New Roman" w:hAnsi="Times New Roman" w:cs="Times New Roman"/>
-          <w:sz w:val="24"/>
-          <w:szCs w:val="24"/>
-          <w:lang w:val="en-CA"/>
-        </w:rPr>
-      </w:pPr>
-    </w:p>
-    <w:p>
-      <w:pPr>
-        <w:rPr>
-          <w:rFonts w:ascii="Times New Roman" w:hAnsi="Times New Roman" w:cs="Times New Roman"/>
-          <w:sz w:val="24"/>
-          <w:szCs w:val="24"/>
-          <w:lang w:val="en-CA"/>
-        </w:rPr>
-      </w:pPr>
-    </w:p>
-    <w:p>
-      <w:pPr>
-        <w:rPr>
-          <w:rFonts w:ascii="Times New Roman" w:hAnsi="Times New Roman" w:cs="Times New Roman"/>
-          <w:sz w:val="24"/>
-          <w:szCs w:val="24"/>
-          <w:lang w:val="en-CA"/>
-        </w:rPr>
-      </w:pPr>
-      <w:r>
-        <w:rPr>
-          <w:rFonts w:ascii="Times New Roman" w:hAnsi="Times New Roman" w:cs="Times New Roman"/>
-          <w:sz w:val="24"/>
-          <w:szCs w:val="24"/>
-          <w:lang w:val="en-CA"/>
-        </w:rPr>
-        <w:lastRenderedPageBreak/>
+      <w:r>
+        <w:rPr>
+          <w:rFonts w:ascii="Times New Roman" w:hAnsi="Times New Roman" w:cs="Times New Roman"/>
+          <w:sz w:val="24"/>
+          <w:szCs w:val="24"/>
+          <w:lang w:val="en-CA"/>
+        </w:rPr>
+        <w:t>2026-07-03</w:t>
+      </w:r>
+    </w:p>
+    <w:p>
+      <w:pPr>
+        <w:rPr>
+          <w:rFonts w:ascii="Times New Roman" w:hAnsi="Times New Roman" w:cs="Times New Roman"/>
+          <w:sz w:val="24"/>
+          <w:szCs w:val="24"/>
+          <w:lang w:val="en-CA"/>
+        </w:rPr>
+      </w:pPr>
+      <w:r>
+        <w:rPr>
+          <w:rFonts w:ascii="Times New Roman" w:hAnsi="Times New Roman" w:cs="Times New Roman"/>
+          <w:sz w:val="24"/>
+          <w:szCs w:val="24"/>
+          <w:lang w:val="en-CA"/>
+        </w:rPr>
+        <w:t xml:space="preserve">Refactored code out of </w:t>
+      </w:r>
+      <w:proofErr w:type="spellStart"/>
+      <w:r>
+        <w:rPr>
+          <w:rFonts w:ascii="Times New Roman" w:hAnsi="Times New Roman" w:cs="Times New Roman"/>
+          <w:sz w:val="24"/>
+          <w:szCs w:val="24"/>
+          <w:lang w:val="en-CA"/>
+        </w:rPr>
+        <w:t>jupyter</w:t>
+      </w:r>
+      <w:proofErr w:type="spellEnd"/>
+      <w:r>
+        <w:rPr>
+          <w:rFonts w:ascii="Times New Roman" w:hAnsi="Times New Roman" w:cs="Times New Roman"/>
+          <w:sz w:val="24"/>
+          <w:szCs w:val="24"/>
+          <w:lang w:val="en-CA"/>
+        </w:rPr>
+        <w:t xml:space="preserve"> notebook and will create a </w:t>
+      </w:r>
+      <w:proofErr w:type="spellStart"/>
+      <w:r>
+        <w:rPr>
+          <w:rFonts w:ascii="Times New Roman" w:hAnsi="Times New Roman" w:cs="Times New Roman"/>
+          <w:sz w:val="24"/>
+          <w:szCs w:val="24"/>
+          <w:lang w:val="en-CA"/>
+        </w:rPr>
+        <w:t>tkinter</w:t>
+      </w:r>
+      <w:proofErr w:type="spellEnd"/>
+      <w:r>
+        <w:rPr>
+          <w:rFonts w:ascii="Times New Roman" w:hAnsi="Times New Roman" w:cs="Times New Roman"/>
+          <w:sz w:val="24"/>
+          <w:szCs w:val="24"/>
+          <w:lang w:val="en-CA"/>
+        </w:rPr>
+        <w:t xml:space="preserve"> GUI with some extra features, will focus on GUI for now, + login encryption feature using some old code </w:t>
+      </w:r>
+    </w:p>
+    <w:p>
+      <w:pPr>
+        <w:rPr>
+          <w:rFonts w:ascii="Times New Roman" w:hAnsi="Times New Roman" w:cs="Times New Roman"/>
+          <w:sz w:val="24"/>
+          <w:szCs w:val="24"/>
+          <w:lang w:val="en-CA"/>
+        </w:rPr>
+      </w:pPr>
+    </w:p>
+    <w:p>
+      <w:pPr>
+        <w:rPr>
+          <w:rFonts w:ascii="Times New Roman" w:hAnsi="Times New Roman" w:cs="Times New Roman"/>
+          <w:sz w:val="24"/>
+          <w:szCs w:val="24"/>
+          <w:lang w:val="en-CA"/>
+        </w:rPr>
+      </w:pPr>
+    </w:p>
+    <w:p>
+      <w:pPr>
+        <w:rPr>
+          <w:rFonts w:ascii="Times New Roman" w:hAnsi="Times New Roman" w:cs="Times New Roman"/>
+          <w:sz w:val="24"/>
+          <w:szCs w:val="24"/>
+          <w:lang w:val="en-CA"/>
+        </w:rPr>
+      </w:pPr>
+    </w:p>
+    <w:p>
+      <w:pPr>
+        <w:rPr>
+          <w:rFonts w:ascii="Times New Roman" w:hAnsi="Times New Roman" w:cs="Times New Roman"/>
+          <w:sz w:val="24"/>
+          <w:szCs w:val="24"/>
+          <w:lang w:val="en-CA"/>
+        </w:rPr>
+      </w:pPr>
+    </w:p>
+    <w:p>
+      <w:pPr>
+        <w:rPr>
+          <w:rFonts w:ascii="Times New Roman" w:hAnsi="Times New Roman" w:cs="Times New Roman"/>
+          <w:sz w:val="24"/>
+          <w:szCs w:val="24"/>
+          <w:lang w:val="en-CA"/>
+        </w:rPr>
+      </w:pPr>
+    </w:p>
+    <w:p>
+      <w:pPr>
+        <w:rPr>
+          <w:rFonts w:ascii="Times New Roman" w:hAnsi="Times New Roman" w:cs="Times New Roman"/>
+          <w:sz w:val="24"/>
+          <w:szCs w:val="24"/>
+          <w:lang w:val="en-CA"/>
+        </w:rPr>
+      </w:pPr>
+    </w:p>
+    <w:p>
+      <w:pPr>
+        <w:rPr>
+          <w:rFonts w:ascii="Times New Roman" w:hAnsi="Times New Roman" w:cs="Times New Roman"/>
+          <w:sz w:val="24"/>
+          <w:szCs w:val="24"/>
+          <w:lang w:val="en-CA"/>
+        </w:rPr>
+      </w:pPr>
+    </w:p>
+    <w:p>
+      <w:pPr>
+        <w:rPr>
+          <w:rFonts w:ascii="Times New Roman" w:hAnsi="Times New Roman" w:cs="Times New Roman"/>
+          <w:sz w:val="24"/>
+          <w:szCs w:val="24"/>
+          <w:lang w:val="en-CA"/>
+        </w:rPr>
+      </w:pPr>
+      <w:r>
+        <w:rPr>
+          <w:rFonts w:ascii="Times New Roman" w:hAnsi="Times New Roman" w:cs="Times New Roman"/>
+          <w:sz w:val="24"/>
+          <w:szCs w:val="24"/>
+          <w:lang w:val="en-CA"/>
+        </w:rPr>
         <w:t xml:space="preserve">For my model, </w:t>
       </w:r>
       <w:r>
@@ -732,6 +809,7 @@
       <w:r>
         <w:rPr>
           <w:rFonts w:ascii="Times New Roman" w:hAnsi="Times New Roman" w:cs="Times New Roman"/>
+          <w:noProof/>
           <w:sz w:val="24"/>
           <w:szCs w:val="24"/>
           <w:lang w:val="en-CA"/>
@@ -1606,6 +1684,7 @@
   <w:style w:type="character" w:default="1" w:styleId="DefaultParagraphFont">
     <w:name w:val="Default Paragraph Font"/>
     <w:uiPriority w:val="1"/>
+    <w:semiHidden/>
     <w:unhideWhenUsed/>
   </w:style>
   <w:style w:type="table" w:default="1" w:styleId="TableNormal">

</xml_diff>

<commit_message>
Jul 3, 2026, 5:11 PM
</commit_message>
<xml_diff>
--- a/Notes.docx
+++ b/Notes.docx
@@ -358,7 +358,27 @@
           <w:szCs w:val="24"/>
           <w:lang w:val="en-CA"/>
         </w:rPr>
-        <w:t>After accumulating data, I export as an excel file for later use such as uploading to a database in SQL Server. I also trained a NLP model to try and interpret human language</w:t>
+        <w:t xml:space="preserve">After accumulating data, I export as an excel file for later use such as uploading to a database in SQL Server. I also trained </w:t>
+      </w:r>
+      <w:proofErr w:type="gramStart"/>
+      <w:r>
+        <w:rPr>
+          <w:rFonts w:ascii="Times New Roman" w:hAnsi="Times New Roman" w:cs="Times New Roman"/>
+          <w:sz w:val="24"/>
+          <w:szCs w:val="24"/>
+          <w:lang w:val="en-CA"/>
+        </w:rPr>
+        <w:t>a</w:t>
+      </w:r>
+      <w:proofErr w:type="gramEnd"/>
+      <w:r>
+        <w:rPr>
+          <w:rFonts w:ascii="Times New Roman" w:hAnsi="Times New Roman" w:cs="Times New Roman"/>
+          <w:sz w:val="24"/>
+          <w:szCs w:val="24"/>
+          <w:lang w:val="en-CA"/>
+        </w:rPr>
+        <w:t xml:space="preserve"> NLP model to try and interpret human language</w:t>
       </w:r>
       <w:r>
         <w:rPr>
@@ -670,6 +690,65 @@
           <w:lang w:val="en-CA"/>
         </w:rPr>
         <w:t xml:space="preserve"> GUI with some extra features, will focus on GUI for now, + login encryption feature using some old code </w:t>
+      </w:r>
+    </w:p>
+    <w:p>
+      <w:pPr>
+        <w:rPr>
+          <w:rFonts w:ascii="Times New Roman" w:hAnsi="Times New Roman" w:cs="Times New Roman"/>
+          <w:sz w:val="24"/>
+          <w:szCs w:val="24"/>
+          <w:lang w:val="en-CA"/>
+        </w:rPr>
+      </w:pPr>
+      <w:r>
+        <w:rPr>
+          <w:rFonts w:ascii="Times New Roman" w:hAnsi="Times New Roman" w:cs="Times New Roman"/>
+          <w:sz w:val="24"/>
+          <w:szCs w:val="24"/>
+          <w:lang w:val="en-CA"/>
+        </w:rPr>
+        <w:t xml:space="preserve">Also reconsidering how the patterns get scraped into excel files, need to decide whether to create an excel sheet with multiple pages or just start using a </w:t>
+      </w:r>
+      <w:proofErr w:type="spellStart"/>
+      <w:r>
+        <w:rPr>
+          <w:rFonts w:ascii="Times New Roman" w:hAnsi="Times New Roman" w:cs="Times New Roman"/>
+          <w:sz w:val="24"/>
+          <w:szCs w:val="24"/>
+          <w:lang w:val="en-CA"/>
+        </w:rPr>
+        <w:t>sqlite</w:t>
+      </w:r>
+      <w:proofErr w:type="spellEnd"/>
+      <w:r>
+        <w:rPr>
+          <w:rFonts w:ascii="Times New Roman" w:hAnsi="Times New Roman" w:cs="Times New Roman"/>
+          <w:sz w:val="24"/>
+          <w:szCs w:val="24"/>
+          <w:lang w:val="en-CA"/>
+        </w:rPr>
+        <w:t xml:space="preserve"> </w:t>
+      </w:r>
+      <w:proofErr w:type="spellStart"/>
+      <w:r>
+        <w:rPr>
+          <w:rFonts w:ascii="Times New Roman" w:hAnsi="Times New Roman" w:cs="Times New Roman"/>
+          <w:sz w:val="24"/>
+          <w:szCs w:val="24"/>
+          <w:lang w:val="en-CA"/>
+        </w:rPr>
+        <w:t>db</w:t>
+      </w:r>
+      <w:proofErr w:type="spellEnd"/>
+      <w:r>
+        <w:rPr>
+          <w:rFonts w:ascii="Times New Roman" w:hAnsi="Times New Roman" w:cs="Times New Roman"/>
+          <w:sz w:val="24"/>
+          <w:szCs w:val="24"/>
+          <w:lang w:val="en-CA"/>
+        </w:rPr>
+        <w:t xml:space="preserve"> to store individual patterns</w:t>
       </w:r>
     </w:p>
     <w:p>

</xml_diff>

<commit_message>
Jul 3, 2026, 5:14 PM
</commit_message>
<xml_diff>
--- a/Notes.docx
+++ b/Notes.docx
@@ -630,7 +630,43 @@
           <w:szCs w:val="24"/>
           <w:lang w:val="en-CA"/>
         </w:rPr>
-        <w:t>2026-07-03</w:t>
+        <w:t xml:space="preserve">For my model, </w:t>
+      </w:r>
+      <w:r>
+        <w:rPr>
+          <w:rFonts w:ascii="Times New Roman" w:hAnsi="Times New Roman" w:cs="Times New Roman"/>
+          <w:sz w:val="24"/>
+          <w:szCs w:val="24"/>
+          <w:lang w:val="en-CA"/>
+        </w:rPr>
+        <w:t>I converted 1- and 2-star ratings to negative, 3- star as neutral, and 4- and 5- star as positive. However, I am wondering if a 3- star rating is considered positive</w:t>
+      </w:r>
+      <w:r>
+        <w:rPr>
+          <w:rFonts w:ascii="Times New Roman" w:hAnsi="Times New Roman" w:cs="Times New Roman"/>
+          <w:sz w:val="24"/>
+          <w:szCs w:val="24"/>
+          <w:lang w:val="en-CA"/>
+        </w:rPr>
+        <w:t xml:space="preserve"> rather than neutral and I</w:t>
+      </w:r>
+      <w:r>
+        <w:rPr>
+          <w:rFonts w:ascii="Times New Roman" w:hAnsi="Times New Roman" w:cs="Times New Roman"/>
+          <w:sz w:val="24"/>
+          <w:szCs w:val="24"/>
+          <w:lang w:val="en-CA"/>
+        </w:rPr>
+        <w:t xml:space="preserve"> would imagine that it depends on </w:t>
+      </w:r>
+      <w:r>
+        <w:rPr>
+          <w:rFonts w:ascii="Times New Roman" w:hAnsi="Times New Roman" w:cs="Times New Roman"/>
+          <w:sz w:val="24"/>
+          <w:szCs w:val="24"/>
+          <w:lang w:val="en-CA"/>
+        </w:rPr>
+        <w:t>an individual’s personal rating system, which adds some nuance. Regardless, I moved forward with this rating system and produced the following report:</w:t>
       </w:r>
     </w:p>
     <w:p>
@@ -645,254 +681,12 @@
       <w:r>
         <w:rPr>
           <w:rFonts w:ascii="Times New Roman" w:hAnsi="Times New Roman" w:cs="Times New Roman"/>
-          <w:sz w:val="24"/>
-          <w:szCs w:val="24"/>
-          <w:lang w:val="en-CA"/>
-        </w:rPr>
-        <w:t xml:space="preserve">Refactored code out of </w:t>
-      </w:r>
-      <w:proofErr w:type="spellStart"/>
-      <w:r>
-        <w:rPr>
-          <w:rFonts w:ascii="Times New Roman" w:hAnsi="Times New Roman" w:cs="Times New Roman"/>
-          <w:sz w:val="24"/>
-          <w:szCs w:val="24"/>
-          <w:lang w:val="en-CA"/>
-        </w:rPr>
-        <w:t>jupyter</w:t>
-      </w:r>
-      <w:proofErr w:type="spellEnd"/>
-      <w:r>
-        <w:rPr>
-          <w:rFonts w:ascii="Times New Roman" w:hAnsi="Times New Roman" w:cs="Times New Roman"/>
-          <w:sz w:val="24"/>
-          <w:szCs w:val="24"/>
-          <w:lang w:val="en-CA"/>
-        </w:rPr>
-        <w:t xml:space="preserve"> notebook and will create a </w:t>
-      </w:r>
-      <w:proofErr w:type="spellStart"/>
-      <w:r>
-        <w:rPr>
-          <w:rFonts w:ascii="Times New Roman" w:hAnsi="Times New Roman" w:cs="Times New Roman"/>
-          <w:sz w:val="24"/>
-          <w:szCs w:val="24"/>
-          <w:lang w:val="en-CA"/>
-        </w:rPr>
-        <w:t>tkinter</w:t>
-      </w:r>
-      <w:proofErr w:type="spellEnd"/>
-      <w:r>
-        <w:rPr>
-          <w:rFonts w:ascii="Times New Roman" w:hAnsi="Times New Roman" w:cs="Times New Roman"/>
-          <w:sz w:val="24"/>
-          <w:szCs w:val="24"/>
-          <w:lang w:val="en-CA"/>
-        </w:rPr>
-        <w:t xml:space="preserve"> GUI with some extra features, will focus on GUI for now, + login encryption feature using some old code </w:t>
-      </w:r>
-    </w:p>
-    <w:p>
-      <w:pPr>
-        <w:rPr>
-          <w:rFonts w:ascii="Times New Roman" w:hAnsi="Times New Roman" w:cs="Times New Roman"/>
-          <w:sz w:val="24"/>
-          <w:szCs w:val="24"/>
-          <w:lang w:val="en-CA"/>
-        </w:rPr>
-      </w:pPr>
-      <w:r>
-        <w:rPr>
-          <w:rFonts w:ascii="Times New Roman" w:hAnsi="Times New Roman" w:cs="Times New Roman"/>
-          <w:sz w:val="24"/>
-          <w:szCs w:val="24"/>
-          <w:lang w:val="en-CA"/>
-        </w:rPr>
-        <w:t xml:space="preserve">Also reconsidering how the patterns get scraped into excel files, need to decide whether to create an excel sheet with multiple pages or just start using a </w:t>
-      </w:r>
-      <w:proofErr w:type="spellStart"/>
-      <w:r>
-        <w:rPr>
-          <w:rFonts w:ascii="Times New Roman" w:hAnsi="Times New Roman" w:cs="Times New Roman"/>
-          <w:sz w:val="24"/>
-          <w:szCs w:val="24"/>
-          <w:lang w:val="en-CA"/>
-        </w:rPr>
-        <w:t>sqlite</w:t>
-      </w:r>
-      <w:proofErr w:type="spellEnd"/>
-      <w:r>
-        <w:rPr>
-          <w:rFonts w:ascii="Times New Roman" w:hAnsi="Times New Roman" w:cs="Times New Roman"/>
-          <w:sz w:val="24"/>
-          <w:szCs w:val="24"/>
-          <w:lang w:val="en-CA"/>
-        </w:rPr>
-        <w:t xml:space="preserve"> </w:t>
-      </w:r>
-      <w:proofErr w:type="spellStart"/>
-      <w:r>
-        <w:rPr>
-          <w:rFonts w:ascii="Times New Roman" w:hAnsi="Times New Roman" w:cs="Times New Roman"/>
-          <w:sz w:val="24"/>
-          <w:szCs w:val="24"/>
-          <w:lang w:val="en-CA"/>
-        </w:rPr>
-        <w:t>db</w:t>
-      </w:r>
-      <w:proofErr w:type="spellEnd"/>
-      <w:r>
-        <w:rPr>
-          <w:rFonts w:ascii="Times New Roman" w:hAnsi="Times New Roman" w:cs="Times New Roman"/>
-          <w:sz w:val="24"/>
-          <w:szCs w:val="24"/>
-          <w:lang w:val="en-CA"/>
-        </w:rPr>
-        <w:t xml:space="preserve"> to store individual patterns</w:t>
-      </w:r>
-    </w:p>
-    <w:p>
-      <w:pPr>
-        <w:rPr>
-          <w:rFonts w:ascii="Times New Roman" w:hAnsi="Times New Roman" w:cs="Times New Roman"/>
-          <w:sz w:val="24"/>
-          <w:szCs w:val="24"/>
-          <w:lang w:val="en-CA"/>
-        </w:rPr>
-      </w:pPr>
-    </w:p>
-    <w:p>
-      <w:pPr>
-        <w:rPr>
-          <w:rFonts w:ascii="Times New Roman" w:hAnsi="Times New Roman" w:cs="Times New Roman"/>
-          <w:sz w:val="24"/>
-          <w:szCs w:val="24"/>
-          <w:lang w:val="en-CA"/>
-        </w:rPr>
-      </w:pPr>
-    </w:p>
-    <w:p>
-      <w:pPr>
-        <w:rPr>
-          <w:rFonts w:ascii="Times New Roman" w:hAnsi="Times New Roman" w:cs="Times New Roman"/>
-          <w:sz w:val="24"/>
-          <w:szCs w:val="24"/>
-          <w:lang w:val="en-CA"/>
-        </w:rPr>
-      </w:pPr>
-    </w:p>
-    <w:p>
-      <w:pPr>
-        <w:rPr>
-          <w:rFonts w:ascii="Times New Roman" w:hAnsi="Times New Roman" w:cs="Times New Roman"/>
-          <w:sz w:val="24"/>
-          <w:szCs w:val="24"/>
-          <w:lang w:val="en-CA"/>
-        </w:rPr>
-      </w:pPr>
-    </w:p>
-    <w:p>
-      <w:pPr>
-        <w:rPr>
-          <w:rFonts w:ascii="Times New Roman" w:hAnsi="Times New Roman" w:cs="Times New Roman"/>
-          <w:sz w:val="24"/>
-          <w:szCs w:val="24"/>
-          <w:lang w:val="en-CA"/>
-        </w:rPr>
-      </w:pPr>
-    </w:p>
-    <w:p>
-      <w:pPr>
-        <w:rPr>
-          <w:rFonts w:ascii="Times New Roman" w:hAnsi="Times New Roman" w:cs="Times New Roman"/>
-          <w:sz w:val="24"/>
-          <w:szCs w:val="24"/>
-          <w:lang w:val="en-CA"/>
-        </w:rPr>
-      </w:pPr>
-    </w:p>
-    <w:p>
-      <w:pPr>
-        <w:rPr>
-          <w:rFonts w:ascii="Times New Roman" w:hAnsi="Times New Roman" w:cs="Times New Roman"/>
-          <w:sz w:val="24"/>
-          <w:szCs w:val="24"/>
-          <w:lang w:val="en-CA"/>
-        </w:rPr>
-      </w:pPr>
-    </w:p>
-    <w:p>
-      <w:pPr>
-        <w:rPr>
-          <w:rFonts w:ascii="Times New Roman" w:hAnsi="Times New Roman" w:cs="Times New Roman"/>
-          <w:sz w:val="24"/>
-          <w:szCs w:val="24"/>
-          <w:lang w:val="en-CA"/>
-        </w:rPr>
-      </w:pPr>
-      <w:r>
-        <w:rPr>
-          <w:rFonts w:ascii="Times New Roman" w:hAnsi="Times New Roman" w:cs="Times New Roman"/>
-          <w:sz w:val="24"/>
-          <w:szCs w:val="24"/>
-          <w:lang w:val="en-CA"/>
-        </w:rPr>
-        <w:t xml:space="preserve">For my model, </w:t>
-      </w:r>
-      <w:r>
-        <w:rPr>
-          <w:rFonts w:ascii="Times New Roman" w:hAnsi="Times New Roman" w:cs="Times New Roman"/>
-          <w:sz w:val="24"/>
-          <w:szCs w:val="24"/>
-          <w:lang w:val="en-CA"/>
-        </w:rPr>
-        <w:t>I converted 1- and 2-star ratings to negative, 3- star as neutral, and 4- and 5- star as positive. However, I am wondering if a 3- star rating is considered positive</w:t>
-      </w:r>
-      <w:r>
-        <w:rPr>
-          <w:rFonts w:ascii="Times New Roman" w:hAnsi="Times New Roman" w:cs="Times New Roman"/>
-          <w:sz w:val="24"/>
-          <w:szCs w:val="24"/>
-          <w:lang w:val="en-CA"/>
-        </w:rPr>
-        <w:t xml:space="preserve"> rather than neutral and I</w:t>
-      </w:r>
-      <w:r>
-        <w:rPr>
-          <w:rFonts w:ascii="Times New Roman" w:hAnsi="Times New Roman" w:cs="Times New Roman"/>
-          <w:sz w:val="24"/>
-          <w:szCs w:val="24"/>
-          <w:lang w:val="en-CA"/>
-        </w:rPr>
-        <w:t xml:space="preserve"> would imagine that it depends on </w:t>
-      </w:r>
-      <w:r>
-        <w:rPr>
-          <w:rFonts w:ascii="Times New Roman" w:hAnsi="Times New Roman" w:cs="Times New Roman"/>
-          <w:sz w:val="24"/>
-          <w:szCs w:val="24"/>
-          <w:lang w:val="en-CA"/>
-        </w:rPr>
-        <w:t>an individual’s personal rating system, which adds some nuance. Regardless, I moved forward with this rating system and produced the following report:</w:t>
-      </w:r>
-    </w:p>
-    <w:p>
-      <w:pPr>
-        <w:rPr>
-          <w:rFonts w:ascii="Times New Roman" w:hAnsi="Times New Roman" w:cs="Times New Roman"/>
-          <w:sz w:val="24"/>
-          <w:szCs w:val="24"/>
-          <w:lang w:val="en-CA"/>
-        </w:rPr>
-      </w:pPr>
-      <w:r>
-        <w:rPr>
-          <w:rFonts w:ascii="Times New Roman" w:hAnsi="Times New Roman" w:cs="Times New Roman"/>
           <w:noProof/>
           <w:sz w:val="24"/>
           <w:szCs w:val="24"/>
           <w:lang w:val="en-CA"/>
         </w:rPr>
+        <w:lastRenderedPageBreak/>
         <w:drawing>
           <wp:inline distT="0" distB="0" distL="0" distR="0" wp14:anchorId="4789A38E" wp14:editId="6706D48C">
             <wp:extent cx="4029074" cy="1714500"/>
@@ -1019,6 +813,212 @@
         </w:rPr>
         <w:t xml:space="preserve"> I also see a potential issue in how using an Amazon reviews dataset could cause problems for predicting sentiment in project notes of a knitting project since they are not extremely similar. It’s possible to create my own dataset to train the model but this would take an extremely long time.</w:t>
       </w:r>
+    </w:p>
+    <w:p>
+      <w:pPr>
+        <w:rPr>
+          <w:rFonts w:ascii="Times New Roman" w:hAnsi="Times New Roman" w:cs="Times New Roman"/>
+          <w:sz w:val="24"/>
+          <w:szCs w:val="24"/>
+          <w:lang w:val="en-CA"/>
+        </w:rPr>
+      </w:pPr>
+      <w:r>
+        <w:rPr>
+          <w:rFonts w:ascii="Times New Roman" w:hAnsi="Times New Roman" w:cs="Times New Roman"/>
+          <w:sz w:val="24"/>
+          <w:szCs w:val="24"/>
+          <w:lang w:val="en-CA"/>
+        </w:rPr>
+        <w:t>2026-07-03</w:t>
+      </w:r>
+    </w:p>
+    <w:p>
+      <w:pPr>
+        <w:rPr>
+          <w:rFonts w:ascii="Times New Roman" w:hAnsi="Times New Roman" w:cs="Times New Roman"/>
+          <w:sz w:val="24"/>
+          <w:szCs w:val="24"/>
+          <w:lang w:val="en-CA"/>
+        </w:rPr>
+      </w:pPr>
+      <w:r>
+        <w:rPr>
+          <w:rFonts w:ascii="Times New Roman" w:hAnsi="Times New Roman" w:cs="Times New Roman"/>
+          <w:sz w:val="24"/>
+          <w:szCs w:val="24"/>
+          <w:lang w:val="en-CA"/>
+        </w:rPr>
+        <w:t xml:space="preserve">Refactored code out of </w:t>
+      </w:r>
+      <w:proofErr w:type="spellStart"/>
+      <w:r>
+        <w:rPr>
+          <w:rFonts w:ascii="Times New Roman" w:hAnsi="Times New Roman" w:cs="Times New Roman"/>
+          <w:sz w:val="24"/>
+          <w:szCs w:val="24"/>
+          <w:lang w:val="en-CA"/>
+        </w:rPr>
+        <w:t>jupyter</w:t>
+      </w:r>
+      <w:proofErr w:type="spellEnd"/>
+      <w:r>
+        <w:rPr>
+          <w:rFonts w:ascii="Times New Roman" w:hAnsi="Times New Roman" w:cs="Times New Roman"/>
+          <w:sz w:val="24"/>
+          <w:szCs w:val="24"/>
+          <w:lang w:val="en-CA"/>
+        </w:rPr>
+        <w:t xml:space="preserve"> notebook and will create a </w:t>
+      </w:r>
+      <w:proofErr w:type="spellStart"/>
+      <w:r>
+        <w:rPr>
+          <w:rFonts w:ascii="Times New Roman" w:hAnsi="Times New Roman" w:cs="Times New Roman"/>
+          <w:sz w:val="24"/>
+          <w:szCs w:val="24"/>
+          <w:lang w:val="en-CA"/>
+        </w:rPr>
+        <w:t>tkinter</w:t>
+      </w:r>
+      <w:proofErr w:type="spellEnd"/>
+      <w:r>
+        <w:rPr>
+          <w:rFonts w:ascii="Times New Roman" w:hAnsi="Times New Roman" w:cs="Times New Roman"/>
+          <w:sz w:val="24"/>
+          <w:szCs w:val="24"/>
+          <w:lang w:val="en-CA"/>
+        </w:rPr>
+        <w:t xml:space="preserve"> GUI with some extra features, will focus on GUI for now, + login encryption feature using some old code </w:t>
+      </w:r>
+    </w:p>
+    <w:p>
+      <w:pPr>
+        <w:rPr>
+          <w:rFonts w:ascii="Times New Roman" w:hAnsi="Times New Roman" w:cs="Times New Roman"/>
+          <w:sz w:val="24"/>
+          <w:szCs w:val="24"/>
+          <w:lang w:val="en-CA"/>
+        </w:rPr>
+      </w:pPr>
+      <w:r>
+        <w:rPr>
+          <w:rFonts w:ascii="Times New Roman" w:hAnsi="Times New Roman" w:cs="Times New Roman"/>
+          <w:sz w:val="24"/>
+          <w:szCs w:val="24"/>
+          <w:lang w:val="en-CA"/>
+        </w:rPr>
+        <w:t xml:space="preserve">Also reconsidering how the patterns get scraped into excel files, need to decide whether to create an excel sheet with multiple pages or just start using a </w:t>
+      </w:r>
+      <w:proofErr w:type="spellStart"/>
+      <w:r>
+        <w:rPr>
+          <w:rFonts w:ascii="Times New Roman" w:hAnsi="Times New Roman" w:cs="Times New Roman"/>
+          <w:sz w:val="24"/>
+          <w:szCs w:val="24"/>
+          <w:lang w:val="en-CA"/>
+        </w:rPr>
+        <w:t>sqlite</w:t>
+      </w:r>
+      <w:proofErr w:type="spellEnd"/>
+      <w:r>
+        <w:rPr>
+          <w:rFonts w:ascii="Times New Roman" w:hAnsi="Times New Roman" w:cs="Times New Roman"/>
+          <w:sz w:val="24"/>
+          <w:szCs w:val="24"/>
+          <w:lang w:val="en-CA"/>
+        </w:rPr>
+        <w:t xml:space="preserve"> </w:t>
+      </w:r>
+      <w:proofErr w:type="spellStart"/>
+      <w:r>
+        <w:rPr>
+          <w:rFonts w:ascii="Times New Roman" w:hAnsi="Times New Roman" w:cs="Times New Roman"/>
+          <w:sz w:val="24"/>
+          <w:szCs w:val="24"/>
+          <w:lang w:val="en-CA"/>
+        </w:rPr>
+        <w:t>db</w:t>
+      </w:r>
+      <w:proofErr w:type="spellEnd"/>
+      <w:r>
+        <w:rPr>
+          <w:rFonts w:ascii="Times New Roman" w:hAnsi="Times New Roman" w:cs="Times New Roman"/>
+          <w:sz w:val="24"/>
+          <w:szCs w:val="24"/>
+          <w:lang w:val="en-CA"/>
+        </w:rPr>
+        <w:t xml:space="preserve"> to store individual patterns</w:t>
+      </w:r>
+    </w:p>
+    <w:p>
+      <w:pPr>
+        <w:rPr>
+          <w:rFonts w:ascii="Times New Roman" w:hAnsi="Times New Roman" w:cs="Times New Roman"/>
+          <w:sz w:val="24"/>
+          <w:szCs w:val="24"/>
+          <w:lang w:val="en-CA"/>
+        </w:rPr>
+      </w:pPr>
+      <w:r>
+        <w:rPr>
+          <w:rFonts w:ascii="Times New Roman" w:hAnsi="Times New Roman" w:cs="Times New Roman"/>
+          <w:sz w:val="24"/>
+          <w:szCs w:val="24"/>
+          <w:lang w:val="en-CA"/>
+        </w:rPr>
+        <w:t xml:space="preserve">Also got </w:t>
+      </w:r>
+      <w:proofErr w:type="spellStart"/>
+      <w:r>
+        <w:rPr>
+          <w:rFonts w:ascii="Times New Roman" w:hAnsi="Times New Roman" w:cs="Times New Roman"/>
+          <w:sz w:val="24"/>
+          <w:szCs w:val="24"/>
+          <w:lang w:val="en-CA"/>
+        </w:rPr>
+        <w:t>GitDoc</w:t>
+      </w:r>
+      <w:proofErr w:type="spellEnd"/>
+      <w:r>
+        <w:rPr>
+          <w:rFonts w:ascii="Times New Roman" w:hAnsi="Times New Roman" w:cs="Times New Roman"/>
+          <w:sz w:val="24"/>
+          <w:szCs w:val="24"/>
+          <w:lang w:val="en-CA"/>
+        </w:rPr>
+        <w:t xml:space="preserve"> extension to </w:t>
+      </w:r>
+      <w:proofErr w:type="spellStart"/>
+      <w:r>
+        <w:rPr>
+          <w:rFonts w:ascii="Times New Roman" w:hAnsi="Times New Roman" w:cs="Times New Roman"/>
+          <w:sz w:val="24"/>
+          <w:szCs w:val="24"/>
+          <w:lang w:val="en-CA"/>
+        </w:rPr>
+        <w:t>autocommit</w:t>
+      </w:r>
+      <w:proofErr w:type="spellEnd"/>
+      <w:r>
+        <w:rPr>
+          <w:rFonts w:ascii="Times New Roman" w:hAnsi="Times New Roman" w:cs="Times New Roman"/>
+          <w:sz w:val="24"/>
+          <w:szCs w:val="24"/>
+          <w:lang w:val="en-CA"/>
+        </w:rPr>
+        <w:t xml:space="preserve"> easily, will keep detailed changes in notes instead</w:t>
+      </w:r>
+    </w:p>
+    <w:p>
+      <w:pPr>
+        <w:rPr>
+          <w:rFonts w:ascii="Times New Roman" w:hAnsi="Times New Roman" w:cs="Times New Roman"/>
+          <w:sz w:val="24"/>
+          <w:szCs w:val="24"/>
+          <w:lang w:val="en-CA"/>
+        </w:rPr>
+      </w:pPr>
     </w:p>
     <w:p>
       <w:pPr>

</xml_diff>

<commit_message>
Refactor Ravelry scraper app: modular UI, SQLite migration, model caching, and cancel support
</commit_message>
<xml_diff>
--- a/Notes.docx
+++ b/Notes.docx
@@ -835,6 +835,11 @@
     </w:p>
     <w:p>
       <w:pPr>
+        <w:pStyle w:val="ListParagraph"/>
+        <w:numPr>
+          <w:ilvl w:val="0"/>
+          <w:numId w:val="3"/>
+        </w:numPr>
         <w:rPr>
           <w:rFonts w:ascii="Times New Roman" w:hAnsi="Times New Roman" w:cs="Times New Roman"/>
           <w:sz w:val="24"/>
@@ -894,6 +899,11 @@
     </w:p>
     <w:p>
       <w:pPr>
+        <w:pStyle w:val="ListParagraph"/>
+        <w:numPr>
+          <w:ilvl w:val="0"/>
+          <w:numId w:val="3"/>
+        </w:numPr>
         <w:rPr>
           <w:rFonts w:ascii="Times New Roman" w:hAnsi="Times New Roman" w:cs="Times New Roman"/>
           <w:sz w:val="24"/>
@@ -953,21 +963,26 @@
     </w:p>
     <w:p>
       <w:pPr>
-        <w:rPr>
-          <w:rFonts w:ascii="Times New Roman" w:hAnsi="Times New Roman" w:cs="Times New Roman"/>
-          <w:sz w:val="24"/>
-          <w:szCs w:val="24"/>
-          <w:lang w:val="en-CA"/>
-        </w:rPr>
-      </w:pPr>
-      <w:r>
-        <w:rPr>
-          <w:rFonts w:ascii="Times New Roman" w:hAnsi="Times New Roman" w:cs="Times New Roman"/>
-          <w:sz w:val="24"/>
-          <w:szCs w:val="24"/>
-          <w:lang w:val="en-CA"/>
-        </w:rPr>
-        <w:t xml:space="preserve">Also got </w:t>
+        <w:pStyle w:val="ListParagraph"/>
+        <w:numPr>
+          <w:ilvl w:val="1"/>
+          <w:numId w:val="3"/>
+        </w:numPr>
+        <w:rPr>
+          <w:rFonts w:ascii="Times New Roman" w:hAnsi="Times New Roman" w:cs="Times New Roman"/>
+          <w:sz w:val="24"/>
+          <w:szCs w:val="24"/>
+          <w:lang w:val="en-CA"/>
+        </w:rPr>
+      </w:pPr>
+      <w:r>
+        <w:rPr>
+          <w:rFonts w:ascii="Times New Roman" w:hAnsi="Times New Roman" w:cs="Times New Roman"/>
+          <w:sz w:val="24"/>
+          <w:szCs w:val="24"/>
+          <w:lang w:val="en-CA"/>
+        </w:rPr>
+        <w:t xml:space="preserve">Made </w:t>
       </w:r>
       <w:proofErr w:type="spellStart"/>
       <w:r>
@@ -977,6 +992,704 @@
           <w:szCs w:val="24"/>
           <w:lang w:val="en-CA"/>
         </w:rPr>
+        <w:t>ravelry.db</w:t>
+      </w:r>
+      <w:proofErr w:type="spellEnd"/>
+      <w:r>
+        <w:rPr>
+          <w:rFonts w:ascii="Times New Roman" w:hAnsi="Times New Roman" w:cs="Times New Roman"/>
+          <w:sz w:val="24"/>
+          <w:szCs w:val="24"/>
+          <w:lang w:val="en-CA"/>
+        </w:rPr>
+        <w:t xml:space="preserve">: </w:t>
+      </w:r>
+      <w:r>
+        <w:rPr>
+          <w:rFonts w:ascii="Times New Roman" w:hAnsi="Times New Roman" w:cs="Times New Roman"/>
+          <w:sz w:val="24"/>
+          <w:szCs w:val="24"/>
+        </w:rPr>
+        <w:t>SQLite database replacing Excel files</w:t>
+      </w:r>
+    </w:p>
+    <w:p>
+      <w:pPr>
+        <w:pStyle w:val="ListParagraph"/>
+        <w:numPr>
+          <w:ilvl w:val="2"/>
+          <w:numId w:val="3"/>
+        </w:numPr>
+        <w:rPr>
+          <w:rFonts w:ascii="Times New Roman" w:hAnsi="Times New Roman" w:cs="Times New Roman"/>
+          <w:sz w:val="24"/>
+          <w:szCs w:val="24"/>
+          <w:lang w:val="en-CA"/>
+        </w:rPr>
+      </w:pPr>
+      <w:r>
+        <w:rPr>
+          <w:rFonts w:ascii="Times New Roman" w:hAnsi="Times New Roman" w:cs="Times New Roman"/>
+          <w:sz w:val="24"/>
+          <w:szCs w:val="24"/>
+        </w:rPr>
+        <w:t>Patterns table</w:t>
+      </w:r>
+    </w:p>
+    <w:p>
+      <w:pPr>
+        <w:pStyle w:val="ListParagraph"/>
+        <w:numPr>
+          <w:ilvl w:val="3"/>
+          <w:numId w:val="3"/>
+        </w:numPr>
+        <w:rPr>
+          <w:rFonts w:ascii="Times New Roman" w:hAnsi="Times New Roman" w:cs="Times New Roman"/>
+          <w:sz w:val="24"/>
+          <w:szCs w:val="24"/>
+          <w:lang w:val="en-CA"/>
+        </w:rPr>
+      </w:pPr>
+      <w:r>
+        <w:rPr>
+          <w:rFonts w:ascii="Times New Roman" w:hAnsi="Times New Roman" w:cs="Times New Roman"/>
+          <w:sz w:val="24"/>
+          <w:szCs w:val="24"/>
+        </w:rPr>
+        <w:t xml:space="preserve">Id, slug, </w:t>
+      </w:r>
+      <w:proofErr w:type="spellStart"/>
+      <w:r>
+        <w:rPr>
+          <w:rFonts w:ascii="Times New Roman" w:hAnsi="Times New Roman" w:cs="Times New Roman"/>
+          <w:sz w:val="24"/>
+          <w:szCs w:val="24"/>
+        </w:rPr>
+        <w:t>scraped_at</w:t>
+      </w:r>
+      <w:proofErr w:type="spellEnd"/>
+    </w:p>
+    <w:p>
+      <w:pPr>
+        <w:pStyle w:val="ListParagraph"/>
+        <w:numPr>
+          <w:ilvl w:val="2"/>
+          <w:numId w:val="3"/>
+        </w:numPr>
+        <w:rPr>
+          <w:rFonts w:ascii="Times New Roman" w:hAnsi="Times New Roman" w:cs="Times New Roman"/>
+          <w:sz w:val="24"/>
+          <w:szCs w:val="24"/>
+          <w:lang w:val="en-CA"/>
+        </w:rPr>
+      </w:pPr>
+      <w:r>
+        <w:rPr>
+          <w:rFonts w:ascii="Times New Roman" w:hAnsi="Times New Roman" w:cs="Times New Roman"/>
+          <w:sz w:val="24"/>
+          <w:szCs w:val="24"/>
+        </w:rPr>
+        <w:t>Projects table</w:t>
+      </w:r>
+    </w:p>
+    <w:p>
+      <w:pPr>
+        <w:pStyle w:val="ListParagraph"/>
+        <w:numPr>
+          <w:ilvl w:val="3"/>
+          <w:numId w:val="3"/>
+        </w:numPr>
+        <w:rPr>
+          <w:rFonts w:ascii="Times New Roman" w:hAnsi="Times New Roman" w:cs="Times New Roman"/>
+          <w:sz w:val="24"/>
+          <w:szCs w:val="24"/>
+          <w:lang w:val="en-CA"/>
+        </w:rPr>
+      </w:pPr>
+      <w:r>
+        <w:rPr>
+          <w:rFonts w:ascii="Times New Roman" w:hAnsi="Times New Roman" w:cs="Times New Roman"/>
+          <w:sz w:val="24"/>
+          <w:szCs w:val="24"/>
+          <w:lang w:val="en-CA"/>
+        </w:rPr>
+        <w:t xml:space="preserve">Id, </w:t>
+      </w:r>
+      <w:proofErr w:type="spellStart"/>
+      <w:r>
+        <w:rPr>
+          <w:rFonts w:ascii="Times New Roman" w:hAnsi="Times New Roman" w:cs="Times New Roman"/>
+          <w:sz w:val="24"/>
+          <w:szCs w:val="24"/>
+          <w:lang w:val="en-CA"/>
+        </w:rPr>
+        <w:t>pattern_id</w:t>
+      </w:r>
+      <w:proofErr w:type="spellEnd"/>
+      <w:r>
+        <w:rPr>
+          <w:rFonts w:ascii="Times New Roman" w:hAnsi="Times New Roman" w:cs="Times New Roman"/>
+          <w:sz w:val="24"/>
+          <w:szCs w:val="24"/>
+          <w:lang w:val="en-CA"/>
+        </w:rPr>
+        <w:t xml:space="preserve">, username, </w:t>
+      </w:r>
+      <w:proofErr w:type="spellStart"/>
+      <w:r>
+        <w:rPr>
+          <w:rFonts w:ascii="Times New Roman" w:hAnsi="Times New Roman" w:cs="Times New Roman"/>
+          <w:sz w:val="24"/>
+          <w:szCs w:val="24"/>
+          <w:lang w:val="en-CA"/>
+        </w:rPr>
+        <w:t>yarn_name</w:t>
+      </w:r>
+      <w:proofErr w:type="spellEnd"/>
+      <w:r>
+        <w:rPr>
+          <w:rFonts w:ascii="Times New Roman" w:hAnsi="Times New Roman" w:cs="Times New Roman"/>
+          <w:sz w:val="24"/>
+          <w:szCs w:val="24"/>
+          <w:lang w:val="en-CA"/>
+        </w:rPr>
+        <w:t xml:space="preserve">, </w:t>
+      </w:r>
+      <w:proofErr w:type="spellStart"/>
+      <w:r>
+        <w:rPr>
+          <w:rFonts w:ascii="Times New Roman" w:hAnsi="Times New Roman" w:cs="Times New Roman"/>
+          <w:sz w:val="24"/>
+          <w:szCs w:val="24"/>
+          <w:lang w:val="en-CA"/>
+        </w:rPr>
+        <w:t>yarn_colorway</w:t>
+      </w:r>
+      <w:proofErr w:type="spellEnd"/>
+      <w:r>
+        <w:rPr>
+          <w:rFonts w:ascii="Times New Roman" w:hAnsi="Times New Roman" w:cs="Times New Roman"/>
+          <w:sz w:val="24"/>
+          <w:szCs w:val="24"/>
+          <w:lang w:val="en-CA"/>
+        </w:rPr>
+        <w:t xml:space="preserve">, </w:t>
+      </w:r>
+      <w:proofErr w:type="spellStart"/>
+      <w:r>
+        <w:rPr>
+          <w:rFonts w:ascii="Times New Roman" w:hAnsi="Times New Roman" w:cs="Times New Roman"/>
+          <w:sz w:val="24"/>
+          <w:szCs w:val="24"/>
+          <w:lang w:val="en-CA"/>
+        </w:rPr>
+        <w:t>project_notes</w:t>
+      </w:r>
+      <w:proofErr w:type="spellEnd"/>
+      <w:r>
+        <w:rPr>
+          <w:rFonts w:ascii="Times New Roman" w:hAnsi="Times New Roman" w:cs="Times New Roman"/>
+          <w:sz w:val="24"/>
+          <w:szCs w:val="24"/>
+          <w:lang w:val="en-CA"/>
+        </w:rPr>
+        <w:t xml:space="preserve">, status, date, </w:t>
+      </w:r>
+      <w:proofErr w:type="spellStart"/>
+      <w:r>
+        <w:rPr>
+          <w:rFonts w:ascii="Times New Roman" w:hAnsi="Times New Roman" w:cs="Times New Roman"/>
+          <w:sz w:val="24"/>
+          <w:szCs w:val="24"/>
+          <w:lang w:val="en-CA"/>
+        </w:rPr>
+        <w:t>url</w:t>
+      </w:r>
+      <w:proofErr w:type="spellEnd"/>
+      <w:r>
+        <w:rPr>
+          <w:rFonts w:ascii="Times New Roman" w:hAnsi="Times New Roman" w:cs="Times New Roman"/>
+          <w:sz w:val="24"/>
+          <w:szCs w:val="24"/>
+          <w:lang w:val="en-CA"/>
+        </w:rPr>
+        <w:t>, sentiment</w:t>
+      </w:r>
+    </w:p>
+    <w:p>
+      <w:pPr>
+        <w:pStyle w:val="ListParagraph"/>
+        <w:numPr>
+          <w:ilvl w:val="1"/>
+          <w:numId w:val="3"/>
+        </w:numPr>
+        <w:rPr>
+          <w:rFonts w:ascii="Times New Roman" w:hAnsi="Times New Roman" w:cs="Times New Roman"/>
+          <w:sz w:val="24"/>
+          <w:szCs w:val="24"/>
+          <w:lang w:val="en-CA"/>
+        </w:rPr>
+      </w:pPr>
+      <w:r>
+        <w:rPr>
+          <w:rFonts w:ascii="Times New Roman" w:hAnsi="Times New Roman" w:cs="Times New Roman"/>
+          <w:sz w:val="24"/>
+          <w:szCs w:val="24"/>
+          <w:lang w:val="en-CA"/>
+        </w:rPr>
+        <w:t xml:space="preserve">Create storage.py to add </w:t>
+      </w:r>
+      <w:proofErr w:type="spellStart"/>
+      <w:r>
+        <w:rPr>
+          <w:rFonts w:ascii="Times New Roman" w:hAnsi="Times New Roman" w:cs="Times New Roman"/>
+          <w:sz w:val="24"/>
+          <w:szCs w:val="24"/>
+          <w:lang w:val="en-CA"/>
+        </w:rPr>
+        <w:t>db</w:t>
+      </w:r>
+      <w:proofErr w:type="spellEnd"/>
+      <w:r>
+        <w:rPr>
+          <w:rFonts w:ascii="Times New Roman" w:hAnsi="Times New Roman" w:cs="Times New Roman"/>
+          <w:sz w:val="24"/>
+          <w:szCs w:val="24"/>
+          <w:lang w:val="en-CA"/>
+        </w:rPr>
+        <w:t xml:space="preserve">-specific functions: </w:t>
+      </w:r>
+      <w:proofErr w:type="spellStart"/>
+      <w:r>
+        <w:rPr>
+          <w:rFonts w:ascii="Times New Roman" w:hAnsi="Times New Roman" w:cs="Times New Roman"/>
+          <w:sz w:val="24"/>
+          <w:szCs w:val="24"/>
+          <w:lang w:val="en-CA"/>
+        </w:rPr>
+        <w:t>init_db</w:t>
+      </w:r>
+      <w:proofErr w:type="spellEnd"/>
+      <w:r>
+        <w:rPr>
+          <w:rFonts w:ascii="Times New Roman" w:hAnsi="Times New Roman" w:cs="Times New Roman"/>
+          <w:sz w:val="24"/>
+          <w:szCs w:val="24"/>
+          <w:lang w:val="en-CA"/>
+        </w:rPr>
+        <w:t xml:space="preserve">, </w:t>
+      </w:r>
+      <w:proofErr w:type="spellStart"/>
+      <w:r>
+        <w:rPr>
+          <w:rFonts w:ascii="Times New Roman" w:hAnsi="Times New Roman" w:cs="Times New Roman"/>
+          <w:sz w:val="24"/>
+          <w:szCs w:val="24"/>
+          <w:lang w:val="en-CA"/>
+        </w:rPr>
+        <w:t>save_dataframe</w:t>
+      </w:r>
+      <w:proofErr w:type="spellEnd"/>
+      <w:r>
+        <w:rPr>
+          <w:rFonts w:ascii="Times New Roman" w:hAnsi="Times New Roman" w:cs="Times New Roman"/>
+          <w:sz w:val="24"/>
+          <w:szCs w:val="24"/>
+          <w:lang w:val="en-CA"/>
+        </w:rPr>
+        <w:t xml:space="preserve">, </w:t>
+      </w:r>
+      <w:proofErr w:type="spellStart"/>
+      <w:r>
+        <w:rPr>
+          <w:rFonts w:ascii="Times New Roman" w:hAnsi="Times New Roman" w:cs="Times New Roman"/>
+          <w:sz w:val="24"/>
+          <w:szCs w:val="24"/>
+          <w:lang w:val="en-CA"/>
+        </w:rPr>
+        <w:t>save_predictions</w:t>
+      </w:r>
+      <w:proofErr w:type="spellEnd"/>
+      <w:r>
+        <w:rPr>
+          <w:rFonts w:ascii="Times New Roman" w:hAnsi="Times New Roman" w:cs="Times New Roman"/>
+          <w:sz w:val="24"/>
+          <w:szCs w:val="24"/>
+          <w:lang w:val="en-CA"/>
+        </w:rPr>
+        <w:t xml:space="preserve">, </w:t>
+      </w:r>
+      <w:proofErr w:type="spellStart"/>
+      <w:r>
+        <w:rPr>
+          <w:rFonts w:ascii="Times New Roman" w:hAnsi="Times New Roman" w:cs="Times New Roman"/>
+          <w:sz w:val="24"/>
+          <w:szCs w:val="24"/>
+          <w:lang w:val="en-CA"/>
+        </w:rPr>
+        <w:t>load_dataframe</w:t>
+      </w:r>
+      <w:proofErr w:type="spellEnd"/>
+      <w:r>
+        <w:rPr>
+          <w:rFonts w:ascii="Times New Roman" w:hAnsi="Times New Roman" w:cs="Times New Roman"/>
+          <w:sz w:val="24"/>
+          <w:szCs w:val="24"/>
+          <w:lang w:val="en-CA"/>
+        </w:rPr>
+        <w:t xml:space="preserve">, </w:t>
+      </w:r>
+      <w:proofErr w:type="spellStart"/>
+      <w:r>
+        <w:rPr>
+          <w:rFonts w:ascii="Times New Roman" w:hAnsi="Times New Roman" w:cs="Times New Roman"/>
+          <w:sz w:val="24"/>
+          <w:szCs w:val="24"/>
+          <w:lang w:val="en-CA"/>
+        </w:rPr>
+        <w:t>load_all_patterns</w:t>
+      </w:r>
+      <w:proofErr w:type="spellEnd"/>
+    </w:p>
+    <w:p>
+      <w:pPr>
+        <w:pStyle w:val="ListParagraph"/>
+        <w:numPr>
+          <w:ilvl w:val="0"/>
+          <w:numId w:val="3"/>
+        </w:numPr>
+        <w:rPr>
+          <w:rFonts w:ascii="Times New Roman" w:hAnsi="Times New Roman" w:cs="Times New Roman"/>
+          <w:sz w:val="24"/>
+          <w:szCs w:val="24"/>
+          <w:lang w:val="en-CA"/>
+        </w:rPr>
+      </w:pPr>
+      <w:r>
+        <w:rPr>
+          <w:rFonts w:ascii="Times New Roman" w:hAnsi="Times New Roman" w:cs="Times New Roman"/>
+          <w:sz w:val="24"/>
+          <w:szCs w:val="24"/>
+          <w:lang w:val="en-CA"/>
+        </w:rPr>
+        <w:t>Added model caching to sentiment.py with pickle so training only happens once if sentiment_model.pk1 already exists</w:t>
+      </w:r>
+    </w:p>
+    <w:p>
+      <w:pPr>
+        <w:pStyle w:val="ListParagraph"/>
+        <w:numPr>
+          <w:ilvl w:val="0"/>
+          <w:numId w:val="3"/>
+        </w:numPr>
+        <w:rPr>
+          <w:rFonts w:ascii="Times New Roman" w:hAnsi="Times New Roman" w:cs="Times New Roman"/>
+          <w:sz w:val="24"/>
+          <w:szCs w:val="24"/>
+          <w:lang w:val="en-CA"/>
+        </w:rPr>
+      </w:pPr>
+      <w:proofErr w:type="spellStart"/>
+      <w:r>
+        <w:rPr>
+          <w:rFonts w:ascii="Times New Roman" w:hAnsi="Times New Roman" w:cs="Times New Roman"/>
+          <w:sz w:val="24"/>
+          <w:szCs w:val="24"/>
+          <w:lang w:val="en-CA"/>
+        </w:rPr>
+        <w:t>cancel_event</w:t>
+      </w:r>
+      <w:proofErr w:type="spellEnd"/>
+      <w:r>
+        <w:rPr>
+          <w:rFonts w:ascii="Times New Roman" w:hAnsi="Times New Roman" w:cs="Times New Roman"/>
+          <w:sz w:val="24"/>
+          <w:szCs w:val="24"/>
+          <w:lang w:val="en-CA"/>
+        </w:rPr>
+        <w:t xml:space="preserve"> support</w:t>
+      </w:r>
+    </w:p>
+    <w:p>
+      <w:pPr>
+        <w:pStyle w:val="ListParagraph"/>
+        <w:numPr>
+          <w:ilvl w:val="1"/>
+          <w:numId w:val="3"/>
+        </w:numPr>
+        <w:rPr>
+          <w:rFonts w:ascii="Times New Roman" w:hAnsi="Times New Roman" w:cs="Times New Roman"/>
+          <w:sz w:val="24"/>
+          <w:szCs w:val="24"/>
+          <w:lang w:val="en-CA"/>
+        </w:rPr>
+      </w:pPr>
+      <w:proofErr w:type="spellStart"/>
+      <w:r>
+        <w:rPr>
+          <w:rFonts w:ascii="Times New Roman" w:hAnsi="Times New Roman" w:cs="Times New Roman"/>
+          <w:sz w:val="24"/>
+          <w:szCs w:val="24"/>
+          <w:lang w:val="en-CA"/>
+        </w:rPr>
+        <w:t>cancel_event</w:t>
+      </w:r>
+      <w:proofErr w:type="spellEnd"/>
+      <w:r>
+        <w:rPr>
+          <w:rFonts w:ascii="Times New Roman" w:hAnsi="Times New Roman" w:cs="Times New Roman"/>
+          <w:sz w:val="24"/>
+          <w:szCs w:val="24"/>
+          <w:lang w:val="en-CA"/>
+        </w:rPr>
+        <w:t xml:space="preserve"> currently happens when the logout button is pressed on the main screen, it also only cancels during the scraping between pages (not sure how to optimize this in the future)</w:t>
+      </w:r>
+      <w:r>
+        <w:rPr>
+          <w:rFonts w:ascii="Times New Roman" w:hAnsi="Times New Roman" w:cs="Times New Roman"/>
+          <w:sz w:val="24"/>
+          <w:szCs w:val="24"/>
+          <w:lang w:val="en-CA"/>
+        </w:rPr>
+        <w:t xml:space="preserve">. Considering adding a cancel button as well, unsure </w:t>
+      </w:r>
+      <w:r>
+        <w:rPr>
+          <w:rFonts w:ascii="Times New Roman" w:hAnsi="Times New Roman" w:cs="Times New Roman"/>
+          <w:sz w:val="24"/>
+          <w:szCs w:val="24"/>
+          <w:lang w:val="en-CA"/>
+        </w:rPr>
+        <w:lastRenderedPageBreak/>
+        <w:t>whether it should cancel on logout AND/OR the cancel button or if the cancel event feature should only be triggered with the cancel button but not the login button</w:t>
+      </w:r>
+    </w:p>
+    <w:p>
+      <w:pPr>
+        <w:pStyle w:val="ListParagraph"/>
+        <w:numPr>
+          <w:ilvl w:val="1"/>
+          <w:numId w:val="3"/>
+        </w:numPr>
+        <w:rPr>
+          <w:rFonts w:ascii="Times New Roman" w:hAnsi="Times New Roman" w:cs="Times New Roman"/>
+          <w:sz w:val="24"/>
+          <w:szCs w:val="24"/>
+          <w:lang w:val="en-CA"/>
+        </w:rPr>
+      </w:pPr>
+      <w:r>
+        <w:rPr>
+          <w:rFonts w:ascii="Times New Roman" w:hAnsi="Times New Roman" w:cs="Times New Roman"/>
+          <w:sz w:val="24"/>
+          <w:szCs w:val="24"/>
+          <w:lang w:val="en-CA"/>
+        </w:rPr>
+        <w:t>ravelry_core.py</w:t>
+      </w:r>
+      <w:r>
+        <w:rPr>
+          <w:rFonts w:ascii="Times New Roman" w:hAnsi="Times New Roman" w:cs="Times New Roman"/>
+          <w:sz w:val="24"/>
+          <w:szCs w:val="24"/>
+          <w:lang w:val="en-CA"/>
+        </w:rPr>
+        <w:t>:</w:t>
+      </w:r>
+      <w:r>
+        <w:rPr>
+          <w:rFonts w:ascii="Times New Roman" w:hAnsi="Times New Roman" w:cs="Times New Roman"/>
+          <w:sz w:val="24"/>
+          <w:szCs w:val="24"/>
+          <w:lang w:val="en-CA"/>
+        </w:rPr>
+        <w:t xml:space="preserve"> updated to use SQLite storage, added </w:t>
+      </w:r>
+      <w:proofErr w:type="spellStart"/>
+      <w:r>
+        <w:rPr>
+          <w:rFonts w:ascii="Times New Roman" w:hAnsi="Times New Roman" w:cs="Times New Roman"/>
+          <w:sz w:val="24"/>
+          <w:szCs w:val="24"/>
+          <w:lang w:val="en-CA"/>
+        </w:rPr>
+        <w:t>cancel_event</w:t>
+      </w:r>
+      <w:proofErr w:type="spellEnd"/>
+      <w:r>
+        <w:rPr>
+          <w:rFonts w:ascii="Times New Roman" w:hAnsi="Times New Roman" w:cs="Times New Roman"/>
+          <w:sz w:val="24"/>
+          <w:szCs w:val="24"/>
+          <w:lang w:val="en-CA"/>
+        </w:rPr>
+        <w:t xml:space="preserve"> support</w:t>
+      </w:r>
+    </w:p>
+    <w:p>
+      <w:pPr>
+        <w:pStyle w:val="ListParagraph"/>
+        <w:numPr>
+          <w:ilvl w:val="1"/>
+          <w:numId w:val="3"/>
+        </w:numPr>
+        <w:rPr>
+          <w:rFonts w:ascii="Times New Roman" w:hAnsi="Times New Roman" w:cs="Times New Roman"/>
+          <w:sz w:val="24"/>
+          <w:szCs w:val="24"/>
+          <w:lang w:val="en-CA"/>
+        </w:rPr>
+      </w:pPr>
+      <w:r>
+        <w:rPr>
+          <w:rFonts w:ascii="Times New Roman" w:hAnsi="Times New Roman" w:cs="Times New Roman"/>
+          <w:sz w:val="24"/>
+          <w:szCs w:val="24"/>
+          <w:lang w:val="en-CA"/>
+        </w:rPr>
+        <w:t>scraper.py</w:t>
+      </w:r>
+      <w:r>
+        <w:rPr>
+          <w:rFonts w:ascii="Times New Roman" w:hAnsi="Times New Roman" w:cs="Times New Roman"/>
+          <w:sz w:val="24"/>
+          <w:szCs w:val="24"/>
+          <w:lang w:val="en-CA"/>
+        </w:rPr>
+        <w:t>:</w:t>
+      </w:r>
+      <w:r>
+        <w:rPr>
+          <w:rFonts w:ascii="Times New Roman" w:hAnsi="Times New Roman" w:cs="Times New Roman"/>
+          <w:sz w:val="24"/>
+          <w:szCs w:val="24"/>
+          <w:lang w:val="en-CA"/>
+        </w:rPr>
+        <w:t xml:space="preserve"> added </w:t>
+      </w:r>
+      <w:proofErr w:type="spellStart"/>
+      <w:r>
+        <w:rPr>
+          <w:rFonts w:ascii="Times New Roman" w:hAnsi="Times New Roman" w:cs="Times New Roman"/>
+          <w:sz w:val="24"/>
+          <w:szCs w:val="24"/>
+          <w:lang w:val="en-CA"/>
+        </w:rPr>
+        <w:t>cancel_event</w:t>
+      </w:r>
+      <w:proofErr w:type="spellEnd"/>
+      <w:r>
+        <w:rPr>
+          <w:rFonts w:ascii="Times New Roman" w:hAnsi="Times New Roman" w:cs="Times New Roman"/>
+          <w:sz w:val="24"/>
+          <w:szCs w:val="24"/>
+          <w:lang w:val="en-CA"/>
+        </w:rPr>
+        <w:t xml:space="preserve"> support in the page loop</w:t>
+      </w:r>
+    </w:p>
+    <w:p>
+      <w:pPr>
+        <w:pStyle w:val="ListParagraph"/>
+        <w:numPr>
+          <w:ilvl w:val="0"/>
+          <w:numId w:val="3"/>
+        </w:numPr>
+        <w:rPr>
+          <w:rFonts w:ascii="Times New Roman" w:hAnsi="Times New Roman" w:cs="Times New Roman"/>
+          <w:sz w:val="24"/>
+          <w:szCs w:val="24"/>
+          <w:lang w:val="en-CA"/>
+        </w:rPr>
+      </w:pPr>
+      <w:r>
+        <w:rPr>
+          <w:rFonts w:ascii="Times New Roman" w:hAnsi="Times New Roman" w:cs="Times New Roman"/>
+          <w:sz w:val="24"/>
+          <w:szCs w:val="24"/>
+          <w:lang w:val="en-CA"/>
+        </w:rPr>
+        <w:t>ravelry_app.py</w:t>
+      </w:r>
+      <w:r>
+        <w:rPr>
+          <w:rFonts w:ascii="Times New Roman" w:hAnsi="Times New Roman" w:cs="Times New Roman"/>
+          <w:sz w:val="24"/>
+          <w:szCs w:val="24"/>
+          <w:lang w:val="en-CA"/>
+        </w:rPr>
+        <w:t>:</w:t>
+      </w:r>
+      <w:r>
+        <w:rPr>
+          <w:rFonts w:ascii="Times New Roman" w:hAnsi="Times New Roman" w:cs="Times New Roman"/>
+          <w:sz w:val="24"/>
+          <w:szCs w:val="24"/>
+          <w:lang w:val="en-CA"/>
+        </w:rPr>
+        <w:t xml:space="preserve"> refactored to use screen classes, added </w:t>
+      </w:r>
+      <w:proofErr w:type="spellStart"/>
+      <w:r>
+        <w:rPr>
+          <w:rFonts w:ascii="Times New Roman" w:hAnsi="Times New Roman" w:cs="Times New Roman"/>
+          <w:sz w:val="24"/>
+          <w:szCs w:val="24"/>
+          <w:lang w:val="en-CA"/>
+        </w:rPr>
+        <w:t>safe_logout</w:t>
+      </w:r>
+      <w:proofErr w:type="spellEnd"/>
+      <w:r>
+        <w:rPr>
+          <w:rFonts w:ascii="Times New Roman" w:hAnsi="Times New Roman" w:cs="Times New Roman"/>
+          <w:sz w:val="24"/>
+          <w:szCs w:val="24"/>
+          <w:lang w:val="en-CA"/>
+        </w:rPr>
+        <w:t xml:space="preserve"> and cancel support</w:t>
+      </w:r>
+    </w:p>
+    <w:p>
+      <w:pPr>
+        <w:pStyle w:val="ListParagraph"/>
+        <w:numPr>
+          <w:ilvl w:val="0"/>
+          <w:numId w:val="3"/>
+        </w:numPr>
+        <w:rPr>
+          <w:rFonts w:ascii="Times New Roman" w:hAnsi="Times New Roman" w:cs="Times New Roman"/>
+          <w:sz w:val="24"/>
+          <w:szCs w:val="24"/>
+          <w:lang w:val="en-CA"/>
+        </w:rPr>
+      </w:pPr>
+      <w:r>
+        <w:rPr>
+          <w:rFonts w:ascii="Times New Roman" w:hAnsi="Times New Roman" w:cs="Times New Roman"/>
+          <w:sz w:val="24"/>
+          <w:szCs w:val="24"/>
+          <w:lang w:val="en-CA"/>
+        </w:rPr>
+        <w:t>Trying out</w:t>
+      </w:r>
+      <w:r>
+        <w:rPr>
+          <w:rFonts w:ascii="Times New Roman" w:hAnsi="Times New Roman" w:cs="Times New Roman"/>
+          <w:sz w:val="24"/>
+          <w:szCs w:val="24"/>
+          <w:lang w:val="en-CA"/>
+        </w:rPr>
+        <w:t xml:space="preserve"> </w:t>
+      </w:r>
+      <w:proofErr w:type="spellStart"/>
+      <w:r>
+        <w:rPr>
+          <w:rFonts w:ascii="Times New Roman" w:hAnsi="Times New Roman" w:cs="Times New Roman"/>
+          <w:sz w:val="24"/>
+          <w:szCs w:val="24"/>
+          <w:lang w:val="en-CA"/>
+        </w:rPr>
         <w:t>GitDoc</w:t>
       </w:r>
       <w:proofErr w:type="spellEnd"/>
@@ -1007,7 +1720,97 @@
           <w:szCs w:val="24"/>
           <w:lang w:val="en-CA"/>
         </w:rPr>
-        <w:t xml:space="preserve"> easily, will keep detailed changes in notes instead</w:t>
+        <w:t xml:space="preserve"> easily</w:t>
+      </w:r>
+    </w:p>
+    <w:p>
+      <w:pPr>
+        <w:pStyle w:val="ListParagraph"/>
+        <w:numPr>
+          <w:ilvl w:val="1"/>
+          <w:numId w:val="3"/>
+        </w:numPr>
+        <w:rPr>
+          <w:rFonts w:ascii="Times New Roman" w:hAnsi="Times New Roman" w:cs="Times New Roman"/>
+          <w:sz w:val="24"/>
+          <w:szCs w:val="24"/>
+          <w:lang w:val="en-CA"/>
+        </w:rPr>
+      </w:pPr>
+      <w:r>
+        <w:rPr>
+          <w:rFonts w:ascii="Times New Roman" w:hAnsi="Times New Roman" w:cs="Times New Roman"/>
+          <w:sz w:val="24"/>
+          <w:szCs w:val="24"/>
+          <w:lang w:val="en-CA"/>
+        </w:rPr>
+        <w:t>Didn’t like it too much, will disable for now</w:t>
+      </w:r>
+    </w:p>
+    <w:p>
+      <w:pPr>
+        <w:pStyle w:val="ListParagraph"/>
+        <w:numPr>
+          <w:ilvl w:val="0"/>
+          <w:numId w:val="3"/>
+        </w:numPr>
+        <w:rPr>
+          <w:rFonts w:ascii="Times New Roman" w:hAnsi="Times New Roman" w:cs="Times New Roman"/>
+          <w:sz w:val="24"/>
+          <w:szCs w:val="24"/>
+          <w:lang w:val="en-CA"/>
+        </w:rPr>
+      </w:pPr>
+      <w:r>
+        <w:rPr>
+          <w:rFonts w:ascii="Times New Roman" w:hAnsi="Times New Roman" w:cs="Times New Roman"/>
+          <w:sz w:val="24"/>
+          <w:szCs w:val="24"/>
+          <w:lang w:val="en-CA"/>
+        </w:rPr>
+        <w:t>Made a screens folder</w:t>
+      </w:r>
+      <w:r>
+        <w:rPr>
+          <w:rFonts w:ascii="Times New Roman" w:hAnsi="Times New Roman" w:cs="Times New Roman"/>
+          <w:sz w:val="24"/>
+          <w:szCs w:val="24"/>
+          <w:lang w:val="en-CA"/>
+        </w:rPr>
+        <w:t>: added __init__.py to make screens a package</w:t>
+      </w:r>
+      <w:r>
+        <w:rPr>
+          <w:rFonts w:ascii="Times New Roman" w:hAnsi="Times New Roman" w:cs="Times New Roman"/>
+          <w:sz w:val="24"/>
+          <w:szCs w:val="24"/>
+          <w:lang w:val="en-CA"/>
+        </w:rPr>
+        <w:t xml:space="preserve">, </w:t>
+      </w:r>
+    </w:p>
+    <w:p>
+      <w:pPr>
+        <w:pStyle w:val="ListParagraph"/>
+        <w:numPr>
+          <w:ilvl w:val="1"/>
+          <w:numId w:val="3"/>
+        </w:numPr>
+        <w:rPr>
+          <w:rFonts w:ascii="Times New Roman" w:hAnsi="Times New Roman" w:cs="Times New Roman"/>
+          <w:sz w:val="24"/>
+          <w:szCs w:val="24"/>
+          <w:lang w:val="en-CA"/>
+        </w:rPr>
+      </w:pPr>
+      <w:r>
+        <w:rPr>
+          <w:rFonts w:ascii="Times New Roman" w:hAnsi="Times New Roman" w:cs="Times New Roman"/>
+          <w:sz w:val="24"/>
+          <w:szCs w:val="24"/>
+          <w:lang w:val="en-CA"/>
+        </w:rPr>
+        <w:t>Login_screen.py, main_screen.py, and results_screen.py (pending) are all UI only</w:t>
       </w:r>
     </w:p>
     <w:p>
@@ -1050,6 +1853,119 @@
 <file path=word/numbering.xml><?xml version="1.0" encoding="utf-8"?>
 <w:numbering xmlns:wpc="http://schemas.microsoft.com/office/word/2010/wordprocessingCanvas" xmlns:cx="http://schemas.microsoft.com/office/drawing/2014/chartex" xmlns:cx1="http://schemas.microsoft.com/office/drawing/2015/9/8/chartex" xmlns:cx2="http://schemas.microsoft.com/office/drawing/2015/10/21/chartex" xmlns:cx3="http://schemas.microsoft.com/office/drawing/2016/5/9/chartex" xmlns:cx4="http://schemas.microsoft.com/office/drawing/2016/5/10/chartex" xmlns:cx5="http://schemas.microsoft.com/office/drawing/2016/5/11/chartex" xmlns:cx6="http://schemas.microsoft.com/office/drawing/2016/5/12/chartex" xmlns:cx7="http://schemas.microsoft.com/office/drawing/2016/5/13/chartex" xmlns:cx8="http://schemas.microsoft.com/office/drawing/2016/5/14/chartex" xmlns:mc="http://schemas.openxmlformats.org/markup-compatibility/2006" xmlns:aink="http://schemas.microsoft.com/office/drawing/2016/ink" xmlns:am3d="http://schemas.microsoft.com/office/drawing/2017/model3d" xmlns:o="urn:schemas-microsoft-com:office:office" xmlns:oel="http://schemas.microsoft.com/office/2019/extlst" xmlns:r="http://schemas.openxmlformats.org/officeDocument/2006/relationships" xmlns:m="http://schemas.openxmlformats.org/officeDocument/2006/math" xmlns:v="urn:schemas-microsoft-com:vml" xmlns:wp14="http://schemas.microsoft.com/office/word/2010/wordprocessingDrawing" xmlns:wp="http://schemas.openxmlformats.org/drawingml/2006/wordprocessingDrawing" xmlns:w10="urn:schemas-microsoft-com:office:word" xmlns:w="http://schemas.openxmlformats.org/wordprocessingml/2006/main" xmlns:w14="http://schemas.microsoft.com/office/word/2010/wordml" xmlns:w15="http://schemas.microsoft.com/office/word/2012/wordml" xmlns:w16cex="http://schemas.microsoft.com/office/word/2018/wordml/cex" xmlns:w16cid="http://schemas.microsoft.com/office/word/2016/wordml/cid" xmlns:w16="http://schemas.microsoft.com/office/word/2018/wordml" xmlns:w16du="http://schemas.microsoft.com/office/word/2023/wordml/word16du" xmlns:w16sdtdh="http://schemas.microsoft.com/office/word/2020/wordml/sdtdatahash" xmlns:w16sdtfl="http://schemas.microsoft.com/office/word/2024/wordml/sdtformatlock" xmlns:w16se="http://schemas.microsoft.com/office/word/2015/wordml/symex" xmlns:wpg="http://schemas.microsoft.com/office/word/2010/wordprocessingGroup" xmlns:wpi="http://schemas.microsoft.com/office/word/2010/wordprocessingInk" xmlns:wne="http://schemas.microsoft.com/office/word/2006/wordml" xmlns:wps="http://schemas.microsoft.com/office/word/2010/wordprocessingShape" mc:Ignorable="w14 w15 w16se w16cid w16 w16cex w16sdtdh w16sdtfl w16du wp14">
   <w:abstractNum w:abstractNumId="0" w15:restartNumberingAfterBreak="0">
+    <w:nsid w:val="20F22C40"/>
+    <w:multiLevelType w:val="hybridMultilevel"/>
+    <w:tmpl w:val="BBE003A4"/>
+    <w:lvl w:ilvl="0" w:tplc="10090001">
+      <w:start w:val="1"/>
+      <w:numFmt w:val="bullet"/>
+      <w:lvlText w:val=""/>
+      <w:lvlJc w:val="left"/>
+      <w:pPr>
+        <w:ind w:left="720" w:hanging="360"/>
+      </w:pPr>
+      <w:rPr>
+        <w:rFonts w:ascii="Symbol" w:hAnsi="Symbol" w:hint="default"/>
+      </w:rPr>
+    </w:lvl>
+    <w:lvl w:ilvl="1" w:tplc="10090003">
+      <w:start w:val="1"/>
+      <w:numFmt w:val="bullet"/>
+      <w:lvlText w:val="o"/>
+      <w:lvlJc w:val="left"/>
+      <w:pPr>
+        <w:ind w:left="1440" w:hanging="360"/>
+      </w:pPr>
+      <w:rPr>
+        <w:rFonts w:ascii="Courier New" w:hAnsi="Courier New" w:cs="Courier New" w:hint="default"/>
+      </w:rPr>
+    </w:lvl>
+    <w:lvl w:ilvl="2" w:tplc="10090005">
+      <w:start w:val="1"/>
+      <w:numFmt w:val="bullet"/>
+      <w:lvlText w:val=""/>
+      <w:lvlJc w:val="left"/>
+      <w:pPr>
+        <w:ind w:left="2160" w:hanging="360"/>
+      </w:pPr>
+      <w:rPr>
+        <w:rFonts w:ascii="Wingdings" w:hAnsi="Wingdings" w:hint="default"/>
+      </w:rPr>
+    </w:lvl>
+    <w:lvl w:ilvl="3" w:tplc="10090001">
+      <w:start w:val="1"/>
+      <w:numFmt w:val="bullet"/>
+      <w:lvlText w:val=""/>
+      <w:lvlJc w:val="left"/>
+      <w:pPr>
+        <w:ind w:left="2880" w:hanging="360"/>
+      </w:pPr>
+      <w:rPr>
+        <w:rFonts w:ascii="Symbol" w:hAnsi="Symbol" w:hint="default"/>
+      </w:rPr>
+    </w:lvl>
+    <w:lvl w:ilvl="4" w:tplc="10090003" w:tentative="1">
+      <w:start w:val="1"/>
+      <w:numFmt w:val="bullet"/>
+      <w:lvlText w:val="o"/>
+      <w:lvlJc w:val="left"/>
+      <w:pPr>
+        <w:ind w:left="3600" w:hanging="360"/>
+      </w:pPr>
+      <w:rPr>
+        <w:rFonts w:ascii="Courier New" w:hAnsi="Courier New" w:cs="Courier New" w:hint="default"/>
+      </w:rPr>
+    </w:lvl>
+    <w:lvl w:ilvl="5" w:tplc="10090005" w:tentative="1">
+      <w:start w:val="1"/>
+      <w:numFmt w:val="bullet"/>
+      <w:lvlText w:val=""/>
+      <w:lvlJc w:val="left"/>
+      <w:pPr>
+        <w:ind w:left="4320" w:hanging="360"/>
+      </w:pPr>
+      <w:rPr>
+        <w:rFonts w:ascii="Wingdings" w:hAnsi="Wingdings" w:hint="default"/>
+      </w:rPr>
+    </w:lvl>
+    <w:lvl w:ilvl="6" w:tplc="10090001" w:tentative="1">
+      <w:start w:val="1"/>
+      <w:numFmt w:val="bullet"/>
+      <w:lvlText w:val=""/>
+      <w:lvlJc w:val="left"/>
+      <w:pPr>
+        <w:ind w:left="5040" w:hanging="360"/>
+      </w:pPr>
+      <w:rPr>
+        <w:rFonts w:ascii="Symbol" w:hAnsi="Symbol" w:hint="default"/>
+      </w:rPr>
+    </w:lvl>
+    <w:lvl w:ilvl="7" w:tplc="10090003" w:tentative="1">
+      <w:start w:val="1"/>
+      <w:numFmt w:val="bullet"/>
+      <w:lvlText w:val="o"/>
+      <w:lvlJc w:val="left"/>
+      <w:pPr>
+        <w:ind w:left="5760" w:hanging="360"/>
+      </w:pPr>
+      <w:rPr>
+        <w:rFonts w:ascii="Courier New" w:hAnsi="Courier New" w:cs="Courier New" w:hint="default"/>
+      </w:rPr>
+    </w:lvl>
+    <w:lvl w:ilvl="8" w:tplc="10090005" w:tentative="1">
+      <w:start w:val="1"/>
+      <w:numFmt w:val="bullet"/>
+      <w:lvlText w:val=""/>
+      <w:lvlJc w:val="left"/>
+      <w:pPr>
+        <w:ind w:left="6480" w:hanging="360"/>
+      </w:pPr>
+      <w:rPr>
+        <w:rFonts w:ascii="Wingdings" w:hAnsi="Wingdings" w:hint="default"/>
+      </w:rPr>
+    </w:lvl>
+  </w:abstractNum>
+  <w:abstractNum w:abstractNumId="1" w15:restartNumberingAfterBreak="0">
     <w:nsid w:val="21003D5B"/>
     <w:multiLevelType w:val="hybridMultilevel"/>
     <w:tmpl w:val="0CF8D4D0"/>
@@ -1162,7 +2078,126 @@
       </w:rPr>
     </w:lvl>
   </w:abstractNum>
+  <w:abstractNum w:abstractNumId="2" w15:restartNumberingAfterBreak="0">
+    <w:nsid w:val="3DFA6B57"/>
+    <w:multiLevelType w:val="hybridMultilevel"/>
+    <w:tmpl w:val="6D8AE010"/>
+    <w:lvl w:ilvl="0" w:tplc="10090001">
+      <w:start w:val="1"/>
+      <w:numFmt w:val="bullet"/>
+      <w:lvlText w:val=""/>
+      <w:lvlJc w:val="left"/>
+      <w:pPr>
+        <w:ind w:left="720" w:hanging="360"/>
+      </w:pPr>
+      <w:rPr>
+        <w:rFonts w:ascii="Symbol" w:hAnsi="Symbol" w:hint="default"/>
+      </w:rPr>
+    </w:lvl>
+    <w:lvl w:ilvl="1" w:tplc="10090003" w:tentative="1">
+      <w:start w:val="1"/>
+      <w:numFmt w:val="bullet"/>
+      <w:lvlText w:val="o"/>
+      <w:lvlJc w:val="left"/>
+      <w:pPr>
+        <w:ind w:left="1440" w:hanging="360"/>
+      </w:pPr>
+      <w:rPr>
+        <w:rFonts w:ascii="Courier New" w:hAnsi="Courier New" w:cs="Courier New" w:hint="default"/>
+      </w:rPr>
+    </w:lvl>
+    <w:lvl w:ilvl="2" w:tplc="10090005" w:tentative="1">
+      <w:start w:val="1"/>
+      <w:numFmt w:val="bullet"/>
+      <w:lvlText w:val=""/>
+      <w:lvlJc w:val="left"/>
+      <w:pPr>
+        <w:ind w:left="2160" w:hanging="360"/>
+      </w:pPr>
+      <w:rPr>
+        <w:rFonts w:ascii="Wingdings" w:hAnsi="Wingdings" w:hint="default"/>
+      </w:rPr>
+    </w:lvl>
+    <w:lvl w:ilvl="3" w:tplc="10090001" w:tentative="1">
+      <w:start w:val="1"/>
+      <w:numFmt w:val="bullet"/>
+      <w:lvlText w:val=""/>
+      <w:lvlJc w:val="left"/>
+      <w:pPr>
+        <w:ind w:left="2880" w:hanging="360"/>
+      </w:pPr>
+      <w:rPr>
+        <w:rFonts w:ascii="Symbol" w:hAnsi="Symbol" w:hint="default"/>
+      </w:rPr>
+    </w:lvl>
+    <w:lvl w:ilvl="4" w:tplc="10090003" w:tentative="1">
+      <w:start w:val="1"/>
+      <w:numFmt w:val="bullet"/>
+      <w:lvlText w:val="o"/>
+      <w:lvlJc w:val="left"/>
+      <w:pPr>
+        <w:ind w:left="3600" w:hanging="360"/>
+      </w:pPr>
+      <w:rPr>
+        <w:rFonts w:ascii="Courier New" w:hAnsi="Courier New" w:cs="Courier New" w:hint="default"/>
+      </w:rPr>
+    </w:lvl>
+    <w:lvl w:ilvl="5" w:tplc="10090005" w:tentative="1">
+      <w:start w:val="1"/>
+      <w:numFmt w:val="bullet"/>
+      <w:lvlText w:val=""/>
+      <w:lvlJc w:val="left"/>
+      <w:pPr>
+        <w:ind w:left="4320" w:hanging="360"/>
+      </w:pPr>
+      <w:rPr>
+        <w:rFonts w:ascii="Wingdings" w:hAnsi="Wingdings" w:hint="default"/>
+      </w:rPr>
+    </w:lvl>
+    <w:lvl w:ilvl="6" w:tplc="10090001" w:tentative="1">
+      <w:start w:val="1"/>
+      <w:numFmt w:val="bullet"/>
+      <w:lvlText w:val=""/>
+      <w:lvlJc w:val="left"/>
+      <w:pPr>
+        <w:ind w:left="5040" w:hanging="360"/>
+      </w:pPr>
+      <w:rPr>
+        <w:rFonts w:ascii="Symbol" w:hAnsi="Symbol" w:hint="default"/>
+      </w:rPr>
+    </w:lvl>
+    <w:lvl w:ilvl="7" w:tplc="10090003" w:tentative="1">
+      <w:start w:val="1"/>
+      <w:numFmt w:val="bullet"/>
+      <w:lvlText w:val="o"/>
+      <w:lvlJc w:val="left"/>
+      <w:pPr>
+        <w:ind w:left="5760" w:hanging="360"/>
+      </w:pPr>
+      <w:rPr>
+        <w:rFonts w:ascii="Courier New" w:hAnsi="Courier New" w:cs="Courier New" w:hint="default"/>
+      </w:rPr>
+    </w:lvl>
+    <w:lvl w:ilvl="8" w:tplc="10090005" w:tentative="1">
+      <w:start w:val="1"/>
+      <w:numFmt w:val="bullet"/>
+      <w:lvlText w:val=""/>
+      <w:lvlJc w:val="left"/>
+      <w:pPr>
+        <w:ind w:left="6480" w:hanging="360"/>
+      </w:pPr>
+      <w:rPr>
+        <w:rFonts w:ascii="Wingdings" w:hAnsi="Wingdings" w:hint="default"/>
+      </w:rPr>
+    </w:lvl>
+  </w:abstractNum>
   <w:num w:numId="1" w16cid:durableId="1950502233">
+    <w:abstractNumId w:val="1"/>
+  </w:num>
+  <w:num w:numId="2" w16cid:durableId="494884781">
+    <w:abstractNumId w:val="2"/>
+  </w:num>
+  <w:num w:numId="3" w16cid:durableId="1531802692">
     <w:abstractNumId w:val="0"/>
   </w:num>
 </w:numbering>
@@ -1763,7 +2798,6 @@
   <w:style w:type="character" w:default="1" w:styleId="DefaultParagraphFont">
     <w:name w:val="Default Paragraph Font"/>
     <w:uiPriority w:val="1"/>
-    <w:semiHidden/>
     <w:unhideWhenUsed/>
   </w:style>
   <w:style w:type="table" w:default="1" w:styleId="TableNormal">

</xml_diff>

<commit_message>
Moved constants into separate file. Archived a few unused files.
</commit_message>
<xml_diff>
--- a/Notes.docx
+++ b/Notes.docx
@@ -358,27 +358,7 @@
           <w:szCs w:val="24"/>
           <w:lang w:val="en-CA"/>
         </w:rPr>
-        <w:t xml:space="preserve">After accumulating data, I export as an excel file for later use such as uploading to a database in SQL Server. I also trained </w:t>
-      </w:r>
-      <w:proofErr w:type="gramStart"/>
-      <w:r>
-        <w:rPr>
-          <w:rFonts w:ascii="Times New Roman" w:hAnsi="Times New Roman" w:cs="Times New Roman"/>
-          <w:sz w:val="24"/>
-          <w:szCs w:val="24"/>
-          <w:lang w:val="en-CA"/>
-        </w:rPr>
-        <w:t>a</w:t>
-      </w:r>
-      <w:proofErr w:type="gramEnd"/>
-      <w:r>
-        <w:rPr>
-          <w:rFonts w:ascii="Times New Roman" w:hAnsi="Times New Roman" w:cs="Times New Roman"/>
-          <w:sz w:val="24"/>
-          <w:szCs w:val="24"/>
-          <w:lang w:val="en-CA"/>
-        </w:rPr>
-        <w:t xml:space="preserve"> NLP model to try and interpret human language</w:t>
+        <w:t>After accumulating data, I export as an excel file for later use such as uploading to a database in SQL Server. I also trained a NLP model to try and interpret human language</w:t>
       </w:r>
       <w:r>
         <w:rPr>
@@ -854,47 +834,7 @@
           <w:szCs w:val="24"/>
           <w:lang w:val="en-CA"/>
         </w:rPr>
-        <w:t xml:space="preserve">Refactored code out of </w:t>
-      </w:r>
-      <w:proofErr w:type="spellStart"/>
-      <w:r>
-        <w:rPr>
-          <w:rFonts w:ascii="Times New Roman" w:hAnsi="Times New Roman" w:cs="Times New Roman"/>
-          <w:sz w:val="24"/>
-          <w:szCs w:val="24"/>
-          <w:lang w:val="en-CA"/>
-        </w:rPr>
-        <w:t>jupyter</w:t>
-      </w:r>
-      <w:proofErr w:type="spellEnd"/>
-      <w:r>
-        <w:rPr>
-          <w:rFonts w:ascii="Times New Roman" w:hAnsi="Times New Roman" w:cs="Times New Roman"/>
-          <w:sz w:val="24"/>
-          <w:szCs w:val="24"/>
-          <w:lang w:val="en-CA"/>
-        </w:rPr>
-        <w:t xml:space="preserve"> notebook and will create a </w:t>
-      </w:r>
-      <w:proofErr w:type="spellStart"/>
-      <w:r>
-        <w:rPr>
-          <w:rFonts w:ascii="Times New Roman" w:hAnsi="Times New Roman" w:cs="Times New Roman"/>
-          <w:sz w:val="24"/>
-          <w:szCs w:val="24"/>
-          <w:lang w:val="en-CA"/>
-        </w:rPr>
-        <w:t>tkinter</w:t>
-      </w:r>
-      <w:proofErr w:type="spellEnd"/>
-      <w:r>
-        <w:rPr>
-          <w:rFonts w:ascii="Times New Roman" w:hAnsi="Times New Roman" w:cs="Times New Roman"/>
-          <w:sz w:val="24"/>
-          <w:szCs w:val="24"/>
-          <w:lang w:val="en-CA"/>
-        </w:rPr>
-        <w:t xml:space="preserve"> GUI with some extra features, will focus on GUI for now, + login encryption feature using some old code </w:t>
+        <w:t xml:space="preserve">Refactored code out of jupyter notebook and will create a tkinter GUI with some extra features, will focus on GUI for now, + login encryption feature using some old code </w:t>
       </w:r>
     </w:p>
     <w:p>
@@ -918,47 +858,7 @@
           <w:szCs w:val="24"/>
           <w:lang w:val="en-CA"/>
         </w:rPr>
-        <w:t xml:space="preserve">Also reconsidering how the patterns get scraped into excel files, need to decide whether to create an excel sheet with multiple pages or just start using a </w:t>
-      </w:r>
-      <w:proofErr w:type="spellStart"/>
-      <w:r>
-        <w:rPr>
-          <w:rFonts w:ascii="Times New Roman" w:hAnsi="Times New Roman" w:cs="Times New Roman"/>
-          <w:sz w:val="24"/>
-          <w:szCs w:val="24"/>
-          <w:lang w:val="en-CA"/>
-        </w:rPr>
-        <w:t>sqlite</w:t>
-      </w:r>
-      <w:proofErr w:type="spellEnd"/>
-      <w:r>
-        <w:rPr>
-          <w:rFonts w:ascii="Times New Roman" w:hAnsi="Times New Roman" w:cs="Times New Roman"/>
-          <w:sz w:val="24"/>
-          <w:szCs w:val="24"/>
-          <w:lang w:val="en-CA"/>
-        </w:rPr>
-        <w:t xml:space="preserve"> </w:t>
-      </w:r>
-      <w:proofErr w:type="spellStart"/>
-      <w:r>
-        <w:rPr>
-          <w:rFonts w:ascii="Times New Roman" w:hAnsi="Times New Roman" w:cs="Times New Roman"/>
-          <w:sz w:val="24"/>
-          <w:szCs w:val="24"/>
-          <w:lang w:val="en-CA"/>
-        </w:rPr>
-        <w:t>db</w:t>
-      </w:r>
-      <w:proofErr w:type="spellEnd"/>
-      <w:r>
-        <w:rPr>
-          <w:rFonts w:ascii="Times New Roman" w:hAnsi="Times New Roman" w:cs="Times New Roman"/>
-          <w:sz w:val="24"/>
-          <w:szCs w:val="24"/>
-          <w:lang w:val="en-CA"/>
-        </w:rPr>
-        <w:t xml:space="preserve"> to store individual patterns</w:t>
+        <w:t>Also reconsidering how the patterns get scraped into excel files, need to decide whether to create an excel sheet with multiple pages or just start using a sqlite db to store individual patterns</w:t>
       </w:r>
     </w:p>
     <w:p>
@@ -982,27 +882,7 @@
           <w:szCs w:val="24"/>
           <w:lang w:val="en-CA"/>
         </w:rPr>
-        <w:t xml:space="preserve">Made </w:t>
-      </w:r>
-      <w:proofErr w:type="spellStart"/>
-      <w:r>
-        <w:rPr>
-          <w:rFonts w:ascii="Times New Roman" w:hAnsi="Times New Roman" w:cs="Times New Roman"/>
-          <w:sz w:val="24"/>
-          <w:szCs w:val="24"/>
-          <w:lang w:val="en-CA"/>
-        </w:rPr>
-        <w:t>ravelry.db</w:t>
-      </w:r>
-      <w:proofErr w:type="spellEnd"/>
-      <w:r>
-        <w:rPr>
-          <w:rFonts w:ascii="Times New Roman" w:hAnsi="Times New Roman" w:cs="Times New Roman"/>
-          <w:sz w:val="24"/>
-          <w:szCs w:val="24"/>
-          <w:lang w:val="en-CA"/>
-        </w:rPr>
-        <w:t xml:space="preserve">: </w:t>
+        <w:t xml:space="preserve">Made ravelry.db: </w:t>
       </w:r>
       <w:r>
         <w:rPr>
@@ -1056,18 +936,8 @@
           <w:sz w:val="24"/>
           <w:szCs w:val="24"/>
         </w:rPr>
-        <w:t xml:space="preserve">Id, slug, </w:t>
-      </w:r>
-      <w:proofErr w:type="spellStart"/>
-      <w:r>
-        <w:rPr>
-          <w:rFonts w:ascii="Times New Roman" w:hAnsi="Times New Roman" w:cs="Times New Roman"/>
-          <w:sz w:val="24"/>
-          <w:szCs w:val="24"/>
-        </w:rPr>
-        <w:t>scraped_at</w:t>
-      </w:r>
-      <w:proofErr w:type="spellEnd"/>
+        <w:t>Id, slug, scraped_at</w:t>
+      </w:r>
     </w:p>
     <w:p>
       <w:pPr>
@@ -1113,107 +983,7 @@
           <w:szCs w:val="24"/>
           <w:lang w:val="en-CA"/>
         </w:rPr>
-        <w:t xml:space="preserve">Id, </w:t>
-      </w:r>
-      <w:proofErr w:type="spellStart"/>
-      <w:r>
-        <w:rPr>
-          <w:rFonts w:ascii="Times New Roman" w:hAnsi="Times New Roman" w:cs="Times New Roman"/>
-          <w:sz w:val="24"/>
-          <w:szCs w:val="24"/>
-          <w:lang w:val="en-CA"/>
-        </w:rPr>
-        <w:t>pattern_id</w:t>
-      </w:r>
-      <w:proofErr w:type="spellEnd"/>
-      <w:r>
-        <w:rPr>
-          <w:rFonts w:ascii="Times New Roman" w:hAnsi="Times New Roman" w:cs="Times New Roman"/>
-          <w:sz w:val="24"/>
-          <w:szCs w:val="24"/>
-          <w:lang w:val="en-CA"/>
-        </w:rPr>
-        <w:t xml:space="preserve">, username, </w:t>
-      </w:r>
-      <w:proofErr w:type="spellStart"/>
-      <w:r>
-        <w:rPr>
-          <w:rFonts w:ascii="Times New Roman" w:hAnsi="Times New Roman" w:cs="Times New Roman"/>
-          <w:sz w:val="24"/>
-          <w:szCs w:val="24"/>
-          <w:lang w:val="en-CA"/>
-        </w:rPr>
-        <w:t>yarn_name</w:t>
-      </w:r>
-      <w:proofErr w:type="spellEnd"/>
-      <w:r>
-        <w:rPr>
-          <w:rFonts w:ascii="Times New Roman" w:hAnsi="Times New Roman" w:cs="Times New Roman"/>
-          <w:sz w:val="24"/>
-          <w:szCs w:val="24"/>
-          <w:lang w:val="en-CA"/>
-        </w:rPr>
-        <w:t xml:space="preserve">, </w:t>
-      </w:r>
-      <w:proofErr w:type="spellStart"/>
-      <w:r>
-        <w:rPr>
-          <w:rFonts w:ascii="Times New Roman" w:hAnsi="Times New Roman" w:cs="Times New Roman"/>
-          <w:sz w:val="24"/>
-          <w:szCs w:val="24"/>
-          <w:lang w:val="en-CA"/>
-        </w:rPr>
-        <w:t>yarn_colorway</w:t>
-      </w:r>
-      <w:proofErr w:type="spellEnd"/>
-      <w:r>
-        <w:rPr>
-          <w:rFonts w:ascii="Times New Roman" w:hAnsi="Times New Roman" w:cs="Times New Roman"/>
-          <w:sz w:val="24"/>
-          <w:szCs w:val="24"/>
-          <w:lang w:val="en-CA"/>
-        </w:rPr>
-        <w:t xml:space="preserve">, </w:t>
-      </w:r>
-      <w:proofErr w:type="spellStart"/>
-      <w:r>
-        <w:rPr>
-          <w:rFonts w:ascii="Times New Roman" w:hAnsi="Times New Roman" w:cs="Times New Roman"/>
-          <w:sz w:val="24"/>
-          <w:szCs w:val="24"/>
-          <w:lang w:val="en-CA"/>
-        </w:rPr>
-        <w:t>project_notes</w:t>
-      </w:r>
-      <w:proofErr w:type="spellEnd"/>
-      <w:r>
-        <w:rPr>
-          <w:rFonts w:ascii="Times New Roman" w:hAnsi="Times New Roman" w:cs="Times New Roman"/>
-          <w:sz w:val="24"/>
-          <w:szCs w:val="24"/>
-          <w:lang w:val="en-CA"/>
-        </w:rPr>
-        <w:t xml:space="preserve">, status, date, </w:t>
-      </w:r>
-      <w:proofErr w:type="spellStart"/>
-      <w:r>
-        <w:rPr>
-          <w:rFonts w:ascii="Times New Roman" w:hAnsi="Times New Roman" w:cs="Times New Roman"/>
-          <w:sz w:val="24"/>
-          <w:szCs w:val="24"/>
-          <w:lang w:val="en-CA"/>
-        </w:rPr>
-        <w:t>url</w:t>
-      </w:r>
-      <w:proofErr w:type="spellEnd"/>
-      <w:r>
-        <w:rPr>
-          <w:rFonts w:ascii="Times New Roman" w:hAnsi="Times New Roman" w:cs="Times New Roman"/>
-          <w:sz w:val="24"/>
-          <w:szCs w:val="24"/>
-          <w:lang w:val="en-CA"/>
-        </w:rPr>
-        <w:t>, sentiment</w:t>
+        <w:t>Id, pattern_id, username, yarn_name, yarn_colorway, project_notes, status, date, url, sentiment</w:t>
       </w:r>
     </w:p>
     <w:p>
@@ -1237,119 +1007,17 @@
           <w:szCs w:val="24"/>
           <w:lang w:val="en-CA"/>
         </w:rPr>
-        <w:t xml:space="preserve">Create storage.py to add </w:t>
-      </w:r>
-      <w:proofErr w:type="spellStart"/>
-      <w:r>
-        <w:rPr>
-          <w:rFonts w:ascii="Times New Roman" w:hAnsi="Times New Roman" w:cs="Times New Roman"/>
-          <w:sz w:val="24"/>
-          <w:szCs w:val="24"/>
-          <w:lang w:val="en-CA"/>
-        </w:rPr>
-        <w:t>db</w:t>
-      </w:r>
-      <w:proofErr w:type="spellEnd"/>
-      <w:r>
-        <w:rPr>
-          <w:rFonts w:ascii="Times New Roman" w:hAnsi="Times New Roman" w:cs="Times New Roman"/>
-          <w:sz w:val="24"/>
-          <w:szCs w:val="24"/>
-          <w:lang w:val="en-CA"/>
-        </w:rPr>
-        <w:t xml:space="preserve">-specific functions: </w:t>
-      </w:r>
-      <w:proofErr w:type="spellStart"/>
-      <w:r>
-        <w:rPr>
-          <w:rFonts w:ascii="Times New Roman" w:hAnsi="Times New Roman" w:cs="Times New Roman"/>
-          <w:sz w:val="24"/>
-          <w:szCs w:val="24"/>
-          <w:lang w:val="en-CA"/>
-        </w:rPr>
-        <w:t>init_db</w:t>
-      </w:r>
-      <w:proofErr w:type="spellEnd"/>
-      <w:r>
-        <w:rPr>
-          <w:rFonts w:ascii="Times New Roman" w:hAnsi="Times New Roman" w:cs="Times New Roman"/>
-          <w:sz w:val="24"/>
-          <w:szCs w:val="24"/>
-          <w:lang w:val="en-CA"/>
-        </w:rPr>
-        <w:t xml:space="preserve">, </w:t>
-      </w:r>
-      <w:proofErr w:type="spellStart"/>
-      <w:r>
-        <w:rPr>
-          <w:rFonts w:ascii="Times New Roman" w:hAnsi="Times New Roman" w:cs="Times New Roman"/>
-          <w:sz w:val="24"/>
-          <w:szCs w:val="24"/>
-          <w:lang w:val="en-CA"/>
-        </w:rPr>
-        <w:t>save_dataframe</w:t>
-      </w:r>
-      <w:proofErr w:type="spellEnd"/>
-      <w:r>
-        <w:rPr>
-          <w:rFonts w:ascii="Times New Roman" w:hAnsi="Times New Roman" w:cs="Times New Roman"/>
-          <w:sz w:val="24"/>
-          <w:szCs w:val="24"/>
-          <w:lang w:val="en-CA"/>
-        </w:rPr>
-        <w:t xml:space="preserve">, </w:t>
-      </w:r>
-      <w:proofErr w:type="spellStart"/>
-      <w:r>
-        <w:rPr>
-          <w:rFonts w:ascii="Times New Roman" w:hAnsi="Times New Roman" w:cs="Times New Roman"/>
-          <w:sz w:val="24"/>
-          <w:szCs w:val="24"/>
-          <w:lang w:val="en-CA"/>
-        </w:rPr>
-        <w:t>save_predictions</w:t>
-      </w:r>
-      <w:proofErr w:type="spellEnd"/>
-      <w:r>
-        <w:rPr>
-          <w:rFonts w:ascii="Times New Roman" w:hAnsi="Times New Roman" w:cs="Times New Roman"/>
-          <w:sz w:val="24"/>
-          <w:szCs w:val="24"/>
-          <w:lang w:val="en-CA"/>
-        </w:rPr>
-        <w:t xml:space="preserve">, </w:t>
-      </w:r>
-      <w:proofErr w:type="spellStart"/>
-      <w:r>
-        <w:rPr>
-          <w:rFonts w:ascii="Times New Roman" w:hAnsi="Times New Roman" w:cs="Times New Roman"/>
-          <w:sz w:val="24"/>
-          <w:szCs w:val="24"/>
-          <w:lang w:val="en-CA"/>
-        </w:rPr>
-        <w:t>load_dataframe</w:t>
-      </w:r>
-      <w:proofErr w:type="spellEnd"/>
-      <w:r>
-        <w:rPr>
-          <w:rFonts w:ascii="Times New Roman" w:hAnsi="Times New Roman" w:cs="Times New Roman"/>
-          <w:sz w:val="24"/>
-          <w:szCs w:val="24"/>
-          <w:lang w:val="en-CA"/>
-        </w:rPr>
-        <w:t xml:space="preserve">, </w:t>
-      </w:r>
-      <w:proofErr w:type="spellStart"/>
-      <w:r>
-        <w:rPr>
-          <w:rFonts w:ascii="Times New Roman" w:hAnsi="Times New Roman" w:cs="Times New Roman"/>
-          <w:sz w:val="24"/>
-          <w:szCs w:val="24"/>
-          <w:lang w:val="en-CA"/>
-        </w:rPr>
-        <w:t>load_all_patterns</w:t>
-      </w:r>
-      <w:proofErr w:type="spellEnd"/>
+        <w:t xml:space="preserve">Create storage.py to add db-specific functions: </w:t>
+      </w:r>
+      <w:r>
+        <w:rPr>
+          <w:rFonts w:ascii="Times New Roman" w:hAnsi="Times New Roman" w:cs="Times New Roman"/>
+          <w:sz w:val="24"/>
+          <w:szCs w:val="24"/>
+          <w:lang w:val="en-CA"/>
+        </w:rPr>
+        <w:t>init_db, save_dataframe, save_predictions, load_dataframe, load_all_patterns</w:t>
+      </w:r>
     </w:p>
     <w:p>
       <w:pPr>
@@ -1389,25 +1057,14 @@
           <w:lang w:val="en-CA"/>
         </w:rPr>
       </w:pPr>
-      <w:proofErr w:type="spellStart"/>
-      <w:r>
-        <w:rPr>
-          <w:rFonts w:ascii="Times New Roman" w:hAnsi="Times New Roman" w:cs="Times New Roman"/>
-          <w:sz w:val="24"/>
-          <w:szCs w:val="24"/>
-          <w:lang w:val="en-CA"/>
-        </w:rPr>
-        <w:t>cancel_event</w:t>
-      </w:r>
-      <w:proofErr w:type="spellEnd"/>
-      <w:r>
-        <w:rPr>
-          <w:rFonts w:ascii="Times New Roman" w:hAnsi="Times New Roman" w:cs="Times New Roman"/>
-          <w:sz w:val="24"/>
-          <w:szCs w:val="24"/>
-          <w:lang w:val="en-CA"/>
-        </w:rPr>
-        <w:t xml:space="preserve"> support</w:t>
+      <w:r>
+        <w:rPr>
+          <w:rFonts w:ascii="Times New Roman" w:hAnsi="Times New Roman" w:cs="Times New Roman"/>
+          <w:sz w:val="24"/>
+          <w:szCs w:val="24"/>
+          <w:lang w:val="en-CA"/>
+        </w:rPr>
+        <w:t>cancel_event support</w:t>
       </w:r>
     </w:p>
     <w:p>
@@ -1424,34 +1081,14 @@
           <w:lang w:val="en-CA"/>
         </w:rPr>
       </w:pPr>
-      <w:proofErr w:type="spellStart"/>
-      <w:r>
-        <w:rPr>
-          <w:rFonts w:ascii="Times New Roman" w:hAnsi="Times New Roman" w:cs="Times New Roman"/>
-          <w:sz w:val="24"/>
-          <w:szCs w:val="24"/>
-          <w:lang w:val="en-CA"/>
-        </w:rPr>
-        <w:t>cancel_event</w:t>
-      </w:r>
-      <w:proofErr w:type="spellEnd"/>
-      <w:r>
-        <w:rPr>
-          <w:rFonts w:ascii="Times New Roman" w:hAnsi="Times New Roman" w:cs="Times New Roman"/>
-          <w:sz w:val="24"/>
-          <w:szCs w:val="24"/>
-          <w:lang w:val="en-CA"/>
-        </w:rPr>
-        <w:t xml:space="preserve"> currently happens when the logout button is pressed on the main screen, it also only cancels during the scraping between pages (not sure how to optimize this in the future)</w:t>
-      </w:r>
-      <w:r>
-        <w:rPr>
-          <w:rFonts w:ascii="Times New Roman" w:hAnsi="Times New Roman" w:cs="Times New Roman"/>
-          <w:sz w:val="24"/>
-          <w:szCs w:val="24"/>
-          <w:lang w:val="en-CA"/>
-        </w:rPr>
-        <w:t xml:space="preserve">. Considering adding a cancel button as well, unsure </w:t>
+      <w:r>
+        <w:rPr>
+          <w:rFonts w:ascii="Times New Roman" w:hAnsi="Times New Roman" w:cs="Times New Roman"/>
+          <w:sz w:val="24"/>
+          <w:szCs w:val="24"/>
+          <w:lang w:val="en-CA"/>
+        </w:rPr>
+        <w:t xml:space="preserve">cancel_event currently happens when the logout button is pressed on the main screen, it also only cancels during the scraping between pages (not sure how to optimize this in the future). Considering adding a cancel button as well, unsure </w:t>
       </w:r>
       <w:r>
         <w:rPr>
@@ -1503,27 +1140,7 @@
           <w:szCs w:val="24"/>
           <w:lang w:val="en-CA"/>
         </w:rPr>
-        <w:t xml:space="preserve"> updated to use SQLite storage, added </w:t>
-      </w:r>
-      <w:proofErr w:type="spellStart"/>
-      <w:r>
-        <w:rPr>
-          <w:rFonts w:ascii="Times New Roman" w:hAnsi="Times New Roman" w:cs="Times New Roman"/>
-          <w:sz w:val="24"/>
-          <w:szCs w:val="24"/>
-          <w:lang w:val="en-CA"/>
-        </w:rPr>
-        <w:t>cancel_event</w:t>
-      </w:r>
-      <w:proofErr w:type="spellEnd"/>
-      <w:r>
-        <w:rPr>
-          <w:rFonts w:ascii="Times New Roman" w:hAnsi="Times New Roman" w:cs="Times New Roman"/>
-          <w:sz w:val="24"/>
-          <w:szCs w:val="24"/>
-          <w:lang w:val="en-CA"/>
-        </w:rPr>
-        <w:t xml:space="preserve"> support</w:t>
+        <w:t xml:space="preserve"> updated to use SQLite storage, added cancel_event support</w:t>
       </w:r>
     </w:p>
     <w:p>
@@ -1565,27 +1182,7 @@
           <w:szCs w:val="24"/>
           <w:lang w:val="en-CA"/>
         </w:rPr>
-        <w:t xml:space="preserve"> added </w:t>
-      </w:r>
-      <w:proofErr w:type="spellStart"/>
-      <w:r>
-        <w:rPr>
-          <w:rFonts w:ascii="Times New Roman" w:hAnsi="Times New Roman" w:cs="Times New Roman"/>
-          <w:sz w:val="24"/>
-          <w:szCs w:val="24"/>
-          <w:lang w:val="en-CA"/>
-        </w:rPr>
-        <w:t>cancel_event</w:t>
-      </w:r>
-      <w:proofErr w:type="spellEnd"/>
-      <w:r>
-        <w:rPr>
-          <w:rFonts w:ascii="Times New Roman" w:hAnsi="Times New Roman" w:cs="Times New Roman"/>
-          <w:sz w:val="24"/>
-          <w:szCs w:val="24"/>
-          <w:lang w:val="en-CA"/>
-        </w:rPr>
-        <w:t xml:space="preserve"> support in the page loop</w:t>
+        <w:t xml:space="preserve"> added cancel_event support in the page loop</w:t>
       </w:r>
     </w:p>
     <w:p>
@@ -1627,27 +1224,7 @@
           <w:szCs w:val="24"/>
           <w:lang w:val="en-CA"/>
         </w:rPr>
-        <w:t xml:space="preserve"> refactored to use screen classes, added </w:t>
-      </w:r>
-      <w:proofErr w:type="spellStart"/>
-      <w:r>
-        <w:rPr>
-          <w:rFonts w:ascii="Times New Roman" w:hAnsi="Times New Roman" w:cs="Times New Roman"/>
-          <w:sz w:val="24"/>
-          <w:szCs w:val="24"/>
-          <w:lang w:val="en-CA"/>
-        </w:rPr>
-        <w:t>safe_logout</w:t>
-      </w:r>
-      <w:proofErr w:type="spellEnd"/>
-      <w:r>
-        <w:rPr>
-          <w:rFonts w:ascii="Times New Roman" w:hAnsi="Times New Roman" w:cs="Times New Roman"/>
-          <w:sz w:val="24"/>
-          <w:szCs w:val="24"/>
-          <w:lang w:val="en-CA"/>
-        </w:rPr>
-        <w:t xml:space="preserve"> and cancel support</w:t>
+        <w:t xml:space="preserve"> refactored to use screen classes, added safe_logout and cancel support</w:t>
       </w:r>
     </w:p>
     <w:p>
@@ -1680,47 +1257,7 @@
           <w:szCs w:val="24"/>
           <w:lang w:val="en-CA"/>
         </w:rPr>
-        <w:t xml:space="preserve"> </w:t>
-      </w:r>
-      <w:proofErr w:type="spellStart"/>
-      <w:r>
-        <w:rPr>
-          <w:rFonts w:ascii="Times New Roman" w:hAnsi="Times New Roman" w:cs="Times New Roman"/>
-          <w:sz w:val="24"/>
-          <w:szCs w:val="24"/>
-          <w:lang w:val="en-CA"/>
-        </w:rPr>
-        <w:t>GitDoc</w:t>
-      </w:r>
-      <w:proofErr w:type="spellEnd"/>
-      <w:r>
-        <w:rPr>
-          <w:rFonts w:ascii="Times New Roman" w:hAnsi="Times New Roman" w:cs="Times New Roman"/>
-          <w:sz w:val="24"/>
-          <w:szCs w:val="24"/>
-          <w:lang w:val="en-CA"/>
-        </w:rPr>
-        <w:t xml:space="preserve"> extension to </w:t>
-      </w:r>
-      <w:proofErr w:type="spellStart"/>
-      <w:r>
-        <w:rPr>
-          <w:rFonts w:ascii="Times New Roman" w:hAnsi="Times New Roman" w:cs="Times New Roman"/>
-          <w:sz w:val="24"/>
-          <w:szCs w:val="24"/>
-          <w:lang w:val="en-CA"/>
-        </w:rPr>
-        <w:t>autocommit</w:t>
-      </w:r>
-      <w:proofErr w:type="spellEnd"/>
-      <w:r>
-        <w:rPr>
-          <w:rFonts w:ascii="Times New Roman" w:hAnsi="Times New Roman" w:cs="Times New Roman"/>
-          <w:sz w:val="24"/>
-          <w:szCs w:val="24"/>
-          <w:lang w:val="en-CA"/>
-        </w:rPr>
-        <w:t xml:space="preserve"> easily</w:t>
+        <w:t xml:space="preserve"> GitDoc extension to autocommit easily</w:t>
       </w:r>
     </w:p>
     <w:p>
@@ -1811,6 +1348,73 @@
           <w:lang w:val="en-CA"/>
         </w:rPr>
         <w:t>Login_screen.py, main_screen.py, and results_screen.py (pending) are all UI only</w:t>
+      </w:r>
+    </w:p>
+    <w:p>
+      <w:pPr>
+        <w:rPr>
+          <w:rFonts w:ascii="Times New Roman" w:hAnsi="Times New Roman" w:cs="Times New Roman"/>
+          <w:sz w:val="24"/>
+          <w:szCs w:val="24"/>
+          <w:lang w:val="en-CA"/>
+        </w:rPr>
+      </w:pPr>
+      <w:r>
+        <w:rPr>
+          <w:rFonts w:ascii="Times New Roman" w:hAnsi="Times New Roman" w:cs="Times New Roman"/>
+          <w:sz w:val="24"/>
+          <w:szCs w:val="24"/>
+          <w:lang w:val="en-CA"/>
+        </w:rPr>
+        <w:t>2026-07-05</w:t>
+      </w:r>
+    </w:p>
+    <w:p>
+      <w:pPr>
+        <w:pStyle w:val="ListParagraph"/>
+        <w:numPr>
+          <w:ilvl w:val="0"/>
+          <w:numId w:val="4"/>
+        </w:numPr>
+        <w:rPr>
+          <w:rFonts w:ascii="Times New Roman" w:hAnsi="Times New Roman" w:cs="Times New Roman"/>
+          <w:sz w:val="24"/>
+          <w:szCs w:val="24"/>
+          <w:lang w:val="en-CA"/>
+        </w:rPr>
+      </w:pPr>
+      <w:r>
+        <w:rPr>
+          <w:rFonts w:ascii="Times New Roman" w:hAnsi="Times New Roman" w:cs="Times New Roman"/>
+          <w:sz w:val="24"/>
+          <w:szCs w:val="24"/>
+          <w:lang w:val="en-CA"/>
+        </w:rPr>
+        <w:t>Moved all constants into my_constants.py, not sure if its recommended but doing it for practice</w:t>
+      </w:r>
+    </w:p>
+    <w:p>
+      <w:pPr>
+        <w:pStyle w:val="ListParagraph"/>
+        <w:numPr>
+          <w:ilvl w:val="0"/>
+          <w:numId w:val="4"/>
+        </w:numPr>
+        <w:rPr>
+          <w:rFonts w:ascii="Times New Roman" w:hAnsi="Times New Roman" w:cs="Times New Roman"/>
+          <w:sz w:val="24"/>
+          <w:szCs w:val="24"/>
+          <w:lang w:val="en-CA"/>
+        </w:rPr>
+      </w:pPr>
+      <w:r>
+        <w:rPr>
+          <w:rFonts w:ascii="Times New Roman" w:hAnsi="Times New Roman" w:cs="Times New Roman"/>
+          <w:sz w:val="24"/>
+          <w:szCs w:val="24"/>
+          <w:lang w:val="en-CA"/>
+        </w:rPr>
+        <w:t>Archived old unused files into archive folder</w:t>
       </w:r>
     </w:p>
     <w:p>
@@ -2079,6 +1683,119 @@
     </w:lvl>
   </w:abstractNum>
   <w:abstractNum w:abstractNumId="2" w15:restartNumberingAfterBreak="0">
+    <w:nsid w:val="248541A1"/>
+    <w:multiLevelType w:val="hybridMultilevel"/>
+    <w:tmpl w:val="09F41B02"/>
+    <w:lvl w:ilvl="0" w:tplc="10090001">
+      <w:start w:val="1"/>
+      <w:numFmt w:val="bullet"/>
+      <w:lvlText w:val=""/>
+      <w:lvlJc w:val="left"/>
+      <w:pPr>
+        <w:ind w:left="720" w:hanging="360"/>
+      </w:pPr>
+      <w:rPr>
+        <w:rFonts w:ascii="Symbol" w:hAnsi="Symbol" w:hint="default"/>
+      </w:rPr>
+    </w:lvl>
+    <w:lvl w:ilvl="1" w:tplc="10090003" w:tentative="1">
+      <w:start w:val="1"/>
+      <w:numFmt w:val="bullet"/>
+      <w:lvlText w:val="o"/>
+      <w:lvlJc w:val="left"/>
+      <w:pPr>
+        <w:ind w:left="1440" w:hanging="360"/>
+      </w:pPr>
+      <w:rPr>
+        <w:rFonts w:ascii="Courier New" w:hAnsi="Courier New" w:cs="Courier New" w:hint="default"/>
+      </w:rPr>
+    </w:lvl>
+    <w:lvl w:ilvl="2" w:tplc="10090005" w:tentative="1">
+      <w:start w:val="1"/>
+      <w:numFmt w:val="bullet"/>
+      <w:lvlText w:val=""/>
+      <w:lvlJc w:val="left"/>
+      <w:pPr>
+        <w:ind w:left="2160" w:hanging="360"/>
+      </w:pPr>
+      <w:rPr>
+        <w:rFonts w:ascii="Wingdings" w:hAnsi="Wingdings" w:hint="default"/>
+      </w:rPr>
+    </w:lvl>
+    <w:lvl w:ilvl="3" w:tplc="10090001" w:tentative="1">
+      <w:start w:val="1"/>
+      <w:numFmt w:val="bullet"/>
+      <w:lvlText w:val=""/>
+      <w:lvlJc w:val="left"/>
+      <w:pPr>
+        <w:ind w:left="2880" w:hanging="360"/>
+      </w:pPr>
+      <w:rPr>
+        <w:rFonts w:ascii="Symbol" w:hAnsi="Symbol" w:hint="default"/>
+      </w:rPr>
+    </w:lvl>
+    <w:lvl w:ilvl="4" w:tplc="10090003" w:tentative="1">
+      <w:start w:val="1"/>
+      <w:numFmt w:val="bullet"/>
+      <w:lvlText w:val="o"/>
+      <w:lvlJc w:val="left"/>
+      <w:pPr>
+        <w:ind w:left="3600" w:hanging="360"/>
+      </w:pPr>
+      <w:rPr>
+        <w:rFonts w:ascii="Courier New" w:hAnsi="Courier New" w:cs="Courier New" w:hint="default"/>
+      </w:rPr>
+    </w:lvl>
+    <w:lvl w:ilvl="5" w:tplc="10090005" w:tentative="1">
+      <w:start w:val="1"/>
+      <w:numFmt w:val="bullet"/>
+      <w:lvlText w:val=""/>
+      <w:lvlJc w:val="left"/>
+      <w:pPr>
+        <w:ind w:left="4320" w:hanging="360"/>
+      </w:pPr>
+      <w:rPr>
+        <w:rFonts w:ascii="Wingdings" w:hAnsi="Wingdings" w:hint="default"/>
+      </w:rPr>
+    </w:lvl>
+    <w:lvl w:ilvl="6" w:tplc="10090001" w:tentative="1">
+      <w:start w:val="1"/>
+      <w:numFmt w:val="bullet"/>
+      <w:lvlText w:val=""/>
+      <w:lvlJc w:val="left"/>
+      <w:pPr>
+        <w:ind w:left="5040" w:hanging="360"/>
+      </w:pPr>
+      <w:rPr>
+        <w:rFonts w:ascii="Symbol" w:hAnsi="Symbol" w:hint="default"/>
+      </w:rPr>
+    </w:lvl>
+    <w:lvl w:ilvl="7" w:tplc="10090003" w:tentative="1">
+      <w:start w:val="1"/>
+      <w:numFmt w:val="bullet"/>
+      <w:lvlText w:val="o"/>
+      <w:lvlJc w:val="left"/>
+      <w:pPr>
+        <w:ind w:left="5760" w:hanging="360"/>
+      </w:pPr>
+      <w:rPr>
+        <w:rFonts w:ascii="Courier New" w:hAnsi="Courier New" w:cs="Courier New" w:hint="default"/>
+      </w:rPr>
+    </w:lvl>
+    <w:lvl w:ilvl="8" w:tplc="10090005" w:tentative="1">
+      <w:start w:val="1"/>
+      <w:numFmt w:val="bullet"/>
+      <w:lvlText w:val=""/>
+      <w:lvlJc w:val="left"/>
+      <w:pPr>
+        <w:ind w:left="6480" w:hanging="360"/>
+      </w:pPr>
+      <w:rPr>
+        <w:rFonts w:ascii="Wingdings" w:hAnsi="Wingdings" w:hint="default"/>
+      </w:rPr>
+    </w:lvl>
+  </w:abstractNum>
+  <w:abstractNum w:abstractNumId="3" w15:restartNumberingAfterBreak="0">
     <w:nsid w:val="3DFA6B57"/>
     <w:multiLevelType w:val="hybridMultilevel"/>
     <w:tmpl w:val="6D8AE010"/>
@@ -2195,10 +1912,13 @@
     <w:abstractNumId w:val="1"/>
   </w:num>
   <w:num w:numId="2" w16cid:durableId="494884781">
-    <w:abstractNumId w:val="2"/>
+    <w:abstractNumId w:val="3"/>
   </w:num>
   <w:num w:numId="3" w16cid:durableId="1531802692">
     <w:abstractNumId w:val="0"/>
+  </w:num>
+  <w:num w:numId="4" w16cid:durableId="1395355776">
+    <w:abstractNumId w:val="2"/>
   </w:num>
 </w:numbering>
 </file>
@@ -2798,6 +2518,7 @@
   <w:style w:type="character" w:default="1" w:styleId="DefaultParagraphFont">
     <w:name w:val="Default Paragraph Font"/>
     <w:uiPriority w:val="1"/>
+    <w:semiHidden/>
     <w:unhideWhenUsed/>
   </w:style>
   <w:style w:type="table" w:default="1" w:styleId="TableNormal">

</xml_diff>